<commit_message>
identifikasi masalah menjadi rumusan masalah
</commit_message>
<xml_diff>
--- a/Ahmad Sudais Proposal TA 2025 (Rencana A).docx
+++ b/Ahmad Sudais Proposal TA 2025 (Rencana A).docx
@@ -1042,7 +1042,7 @@
         </w:numPr>
         <w:ind w:right="-7"/>
       </w:pPr>
-      <w:bookmarkStart w:id="1" w:name="_Toc229427070"/>
+      <w:bookmarkStart w:id="1" w:name="_Toc229519368"/>
       <w:r>
         <w:lastRenderedPageBreak/>
         <w:t>HALAMAN</w:t>
@@ -1829,7 +1829,7 @@
         </w:numPr>
         <w:ind w:right="-7"/>
       </w:pPr>
-      <w:bookmarkStart w:id="2" w:name="_Toc229427071"/>
+      <w:bookmarkStart w:id="2" w:name="_Toc229519369"/>
       <w:r>
         <w:lastRenderedPageBreak/>
         <w:t>PERNYATAAN</w:t>
@@ -2329,7 +2329,7 @@
         <w:spacing w:line="240" w:lineRule="auto"/>
         <w:ind w:right="-7"/>
       </w:pPr>
-      <w:bookmarkStart w:id="3" w:name="_Toc229427072"/>
+      <w:bookmarkStart w:id="3" w:name="_Toc229519370"/>
       <w:r>
         <w:lastRenderedPageBreak/>
         <w:t>DAFTAR ISI</w:t>
@@ -2383,7 +2383,7 @@
           <w:r>
             <w:fldChar w:fldCharType="separate"/>
           </w:r>
-          <w:hyperlink w:anchor="_Toc229427070" w:history="1">
+          <w:hyperlink w:anchor="_Toc229519368" w:history="1">
             <w:r>
               <w:rPr>
                 <w:rStyle w:val="Hyperlink"/>
@@ -2410,7 +2410,7 @@
                 <w:noProof/>
                 <w:webHidden/>
               </w:rPr>
-              <w:instrText xml:space="preserve"> PAGEREF _Toc229427070 \h </w:instrText>
+              <w:instrText xml:space="preserve"> PAGEREF _Toc229519368 \h </w:instrText>
             </w:r>
             <w:r>
               <w:rPr>
@@ -2454,7 +2454,7 @@
               <w14:ligatures w14:val="standardContextual"/>
             </w:rPr>
           </w:pPr>
-          <w:hyperlink w:anchor="_Toc229427071" w:history="1">
+          <w:hyperlink w:anchor="_Toc229519369" w:history="1">
             <w:r>
               <w:rPr>
                 <w:rStyle w:val="Hyperlink"/>
@@ -2481,7 +2481,7 @@
                 <w:noProof/>
                 <w:webHidden/>
               </w:rPr>
-              <w:instrText xml:space="preserve"> PAGEREF _Toc229427071 \h </w:instrText>
+              <w:instrText xml:space="preserve"> PAGEREF _Toc229519369 \h </w:instrText>
             </w:r>
             <w:r>
               <w:rPr>
@@ -2525,7 +2525,7 @@
               <w14:ligatures w14:val="standardContextual"/>
             </w:rPr>
           </w:pPr>
-          <w:hyperlink w:anchor="_Toc229427072" w:history="1">
+          <w:hyperlink w:anchor="_Toc229519370" w:history="1">
             <w:r>
               <w:rPr>
                 <w:rStyle w:val="Hyperlink"/>
@@ -2552,7 +2552,7 @@
                 <w:noProof/>
                 <w:webHidden/>
               </w:rPr>
-              <w:instrText xml:space="preserve"> PAGEREF _Toc229427072 \h </w:instrText>
+              <w:instrText xml:space="preserve"> PAGEREF _Toc229519370 \h </w:instrText>
             </w:r>
             <w:r>
               <w:rPr>
@@ -2596,7 +2596,7 @@
               <w14:ligatures w14:val="standardContextual"/>
             </w:rPr>
           </w:pPr>
-          <w:hyperlink w:anchor="_Toc229427073" w:history="1">
+          <w:hyperlink w:anchor="_Toc229519371" w:history="1">
             <w:r>
               <w:rPr>
                 <w:rStyle w:val="Hyperlink"/>
@@ -2623,7 +2623,7 @@
                 <w:noProof/>
                 <w:webHidden/>
               </w:rPr>
-              <w:instrText xml:space="preserve"> PAGEREF _Toc229427073 \h </w:instrText>
+              <w:instrText xml:space="preserve"> PAGEREF _Toc229519371 \h </w:instrText>
             </w:r>
             <w:r>
               <w:rPr>
@@ -2667,7 +2667,7 @@
               <w14:ligatures w14:val="standardContextual"/>
             </w:rPr>
           </w:pPr>
-          <w:hyperlink w:anchor="_Toc229427074" w:history="1">
+          <w:hyperlink w:anchor="_Toc229519372" w:history="1">
             <w:r>
               <w:rPr>
                 <w:rStyle w:val="Hyperlink"/>
@@ -2695,7 +2695,7 @@
                 <w:noProof/>
                 <w:webHidden/>
               </w:rPr>
-              <w:instrText xml:space="preserve"> PAGEREF _Toc229427074 \h </w:instrText>
+              <w:instrText xml:space="preserve"> PAGEREF _Toc229519372 \h </w:instrText>
             </w:r>
             <w:r>
               <w:rPr>
@@ -2739,7 +2739,7 @@
               <w14:ligatures w14:val="standardContextual"/>
             </w:rPr>
           </w:pPr>
-          <w:hyperlink w:anchor="_Toc229427075" w:history="1">
+          <w:hyperlink w:anchor="_Toc229519373" w:history="1">
             <w:r>
               <w:rPr>
                 <w:rStyle w:val="Hyperlink"/>
@@ -2766,7 +2766,7 @@
                 <w:noProof/>
                 <w:webHidden/>
               </w:rPr>
-              <w:instrText xml:space="preserve"> PAGEREF _Toc229427075 \h </w:instrText>
+              <w:instrText xml:space="preserve"> PAGEREF _Toc229519373 \h </w:instrText>
             </w:r>
             <w:r>
               <w:rPr>
@@ -2810,7 +2810,7 @@
               <w14:ligatures w14:val="standardContextual"/>
             </w:rPr>
           </w:pPr>
-          <w:hyperlink w:anchor="_Toc229427076" w:history="1">
+          <w:hyperlink w:anchor="_Toc229519374" w:history="1">
             <w:r>
               <w:rPr>
                 <w:rStyle w:val="Hyperlink"/>
@@ -2837,7 +2837,7 @@
                 <w:noProof/>
                 <w:webHidden/>
               </w:rPr>
-              <w:instrText xml:space="preserve"> PAGEREF _Toc229427076 \h </w:instrText>
+              <w:instrText xml:space="preserve"> PAGEREF _Toc229519374 \h </w:instrText>
             </w:r>
             <w:r>
               <w:rPr>
@@ -2885,7 +2885,7 @@
               <w14:ligatures w14:val="standardContextual"/>
             </w:rPr>
           </w:pPr>
-          <w:hyperlink w:anchor="_Toc229427077" w:history="1">
+          <w:hyperlink w:anchor="_Toc229519375" w:history="1">
             <w:r>
               <w:rPr>
                 <w:rStyle w:val="Hyperlink"/>
@@ -2931,7 +2931,7 @@
                 <w:noProof/>
                 <w:webHidden/>
               </w:rPr>
-              <w:instrText xml:space="preserve"> PAGEREF _Toc229427077 \h </w:instrText>
+              <w:instrText xml:space="preserve"> PAGEREF _Toc229519375 \h </w:instrText>
             </w:r>
             <w:r>
               <w:rPr>
@@ -2979,7 +2979,7 @@
               <w14:ligatures w14:val="standardContextual"/>
             </w:rPr>
           </w:pPr>
-          <w:hyperlink w:anchor="_Toc229427078" w:history="1">
+          <w:hyperlink w:anchor="_Toc229519376" w:history="1">
             <w:r>
               <w:rPr>
                 <w:rStyle w:val="Hyperlink"/>
@@ -3004,7 +3004,7 @@
                 <w:rStyle w:val="Hyperlink"/>
                 <w:noProof/>
               </w:rPr>
-              <w:t>Identifikasi Masalah</w:t>
+              <w:t>Rumusan Masalah</w:t>
             </w:r>
             <w:r>
               <w:rPr>
@@ -3025,7 +3025,7 @@
                 <w:noProof/>
                 <w:webHidden/>
               </w:rPr>
-              <w:instrText xml:space="preserve"> PAGEREF _Toc229427078 \h </w:instrText>
+              <w:instrText xml:space="preserve"> PAGEREF _Toc229519376 \h </w:instrText>
             </w:r>
             <w:r>
               <w:rPr>
@@ -3073,7 +3073,7 @@
               <w14:ligatures w14:val="standardContextual"/>
             </w:rPr>
           </w:pPr>
-          <w:hyperlink w:anchor="_Toc229427079" w:history="1">
+          <w:hyperlink w:anchor="_Toc229519377" w:history="1">
             <w:r>
               <w:rPr>
                 <w:rStyle w:val="Hyperlink"/>
@@ -3119,7 +3119,7 @@
                 <w:noProof/>
                 <w:webHidden/>
               </w:rPr>
-              <w:instrText xml:space="preserve"> PAGEREF _Toc229427079 \h </w:instrText>
+              <w:instrText xml:space="preserve"> PAGEREF _Toc229519377 \h </w:instrText>
             </w:r>
             <w:r>
               <w:rPr>
@@ -3139,7 +3139,7 @@
                 <w:noProof/>
                 <w:webHidden/>
               </w:rPr>
-              <w:t>4</w:t>
+              <w:t>3</w:t>
             </w:r>
             <w:r>
               <w:rPr>
@@ -3167,7 +3167,7 @@
               <w14:ligatures w14:val="standardContextual"/>
             </w:rPr>
           </w:pPr>
-          <w:hyperlink w:anchor="_Toc229427080" w:history="1">
+          <w:hyperlink w:anchor="_Toc229519378" w:history="1">
             <w:r>
               <w:rPr>
                 <w:rStyle w:val="Hyperlink"/>
@@ -3213,7 +3213,7 @@
                 <w:noProof/>
                 <w:webHidden/>
               </w:rPr>
-              <w:instrText xml:space="preserve"> PAGEREF _Toc229427080 \h </w:instrText>
+              <w:instrText xml:space="preserve"> PAGEREF _Toc229519378 \h </w:instrText>
             </w:r>
             <w:r>
               <w:rPr>
@@ -3257,7 +3257,7 @@
               <w14:ligatures w14:val="standardContextual"/>
             </w:rPr>
           </w:pPr>
-          <w:hyperlink w:anchor="_Toc229427081" w:history="1">
+          <w:hyperlink w:anchor="_Toc229519379" w:history="1">
             <w:r>
               <w:rPr>
                 <w:rStyle w:val="Hyperlink"/>
@@ -3284,7 +3284,7 @@
                 <w:noProof/>
                 <w:webHidden/>
               </w:rPr>
-              <w:instrText xml:space="preserve"> PAGEREF _Toc229427081 \h </w:instrText>
+              <w:instrText xml:space="preserve"> PAGEREF _Toc229519379 \h </w:instrText>
             </w:r>
             <w:r>
               <w:rPr>
@@ -3304,7 +3304,7 @@
                 <w:noProof/>
                 <w:webHidden/>
               </w:rPr>
-              <w:t>6</w:t>
+              <w:t>5</w:t>
             </w:r>
             <w:r>
               <w:rPr>
@@ -3328,7 +3328,7 @@
               <w14:ligatures w14:val="standardContextual"/>
             </w:rPr>
           </w:pPr>
-          <w:hyperlink w:anchor="_Toc229427082" w:history="1">
+          <w:hyperlink w:anchor="_Toc229519380" w:history="1">
             <w:r>
               <w:rPr>
                 <w:rStyle w:val="Hyperlink"/>
@@ -3355,7 +3355,195 @@
                 <w:noProof/>
                 <w:webHidden/>
               </w:rPr>
-              <w:instrText xml:space="preserve"> PAGEREF _Toc229427082 \h </w:instrText>
+              <w:instrText xml:space="preserve"> PAGEREF _Toc229519380 \h </w:instrText>
+            </w:r>
+            <w:r>
+              <w:rPr>
+                <w:noProof/>
+                <w:webHidden/>
+              </w:rPr>
+            </w:r>
+            <w:r>
+              <w:rPr>
+                <w:noProof/>
+                <w:webHidden/>
+              </w:rPr>
+              <w:fldChar w:fldCharType="separate"/>
+            </w:r>
+            <w:r>
+              <w:rPr>
+                <w:noProof/>
+                <w:webHidden/>
+              </w:rPr>
+              <w:t>5</w:t>
+            </w:r>
+            <w:r>
+              <w:rPr>
+                <w:noProof/>
+                <w:webHidden/>
+              </w:rPr>
+              <w:fldChar w:fldCharType="end"/>
+            </w:r>
+          </w:hyperlink>
+        </w:p>
+        <w:p>
+          <w:pPr>
+            <w:pStyle w:val="TOC2"/>
+            <w:tabs>
+              <w:tab w:val="left" w:pos="960"/>
+              <w:tab w:val="right" w:leader="dot" w:pos="7921"/>
+            </w:tabs>
+            <w:rPr>
+              <w:rFonts w:asciiTheme="minorHAnsi" w:eastAsiaTheme="minorEastAsia" w:hAnsiTheme="minorHAnsi" w:cstheme="minorBidi"/>
+              <w:noProof/>
+              <w:kern w:val="2"/>
+              <w:sz w:val="24"/>
+              <w:szCs w:val="24"/>
+              <w:lang w:val="en-ID" w:eastAsia="en-ID"/>
+              <w14:ligatures w14:val="standardContextual"/>
+            </w:rPr>
+          </w:pPr>
+          <w:hyperlink w:anchor="_Toc229519381" w:history="1">
+            <w:r>
+              <w:rPr>
+                <w:rStyle w:val="Hyperlink"/>
+                <w:noProof/>
+              </w:rPr>
+              <w:t xml:space="preserve">2.1. </w:t>
+            </w:r>
+            <w:r>
+              <w:rPr>
+                <w:rFonts w:asciiTheme="minorHAnsi" w:eastAsiaTheme="minorEastAsia" w:hAnsiTheme="minorHAnsi" w:cstheme="minorBidi"/>
+                <w:noProof/>
+                <w:kern w:val="2"/>
+                <w:sz w:val="24"/>
+                <w:szCs w:val="24"/>
+                <w:lang w:val="en-ID" w:eastAsia="en-ID"/>
+                <w14:ligatures w14:val="standardContextual"/>
+              </w:rPr>
+              <w:tab/>
+            </w:r>
+            <w:r>
+              <w:rPr>
+                <w:rStyle w:val="Hyperlink"/>
+                <w:noProof/>
+              </w:rPr>
+              <w:t>Game Simulasi sebagai Media Edukasi Interior</w:t>
+            </w:r>
+            <w:r>
+              <w:rPr>
+                <w:noProof/>
+                <w:webHidden/>
+              </w:rPr>
+              <w:tab/>
+            </w:r>
+            <w:r>
+              <w:rPr>
+                <w:noProof/>
+                <w:webHidden/>
+              </w:rPr>
+              <w:fldChar w:fldCharType="begin"/>
+            </w:r>
+            <w:r>
+              <w:rPr>
+                <w:noProof/>
+                <w:webHidden/>
+              </w:rPr>
+              <w:instrText xml:space="preserve"> PAGEREF _Toc229519381 \h </w:instrText>
+            </w:r>
+            <w:r>
+              <w:rPr>
+                <w:noProof/>
+                <w:webHidden/>
+              </w:rPr>
+            </w:r>
+            <w:r>
+              <w:rPr>
+                <w:noProof/>
+                <w:webHidden/>
+              </w:rPr>
+              <w:fldChar w:fldCharType="separate"/>
+            </w:r>
+            <w:r>
+              <w:rPr>
+                <w:noProof/>
+                <w:webHidden/>
+              </w:rPr>
+              <w:t>5</w:t>
+            </w:r>
+            <w:r>
+              <w:rPr>
+                <w:noProof/>
+                <w:webHidden/>
+              </w:rPr>
+              <w:fldChar w:fldCharType="end"/>
+            </w:r>
+          </w:hyperlink>
+        </w:p>
+        <w:p>
+          <w:pPr>
+            <w:pStyle w:val="TOC2"/>
+            <w:tabs>
+              <w:tab w:val="left" w:pos="960"/>
+              <w:tab w:val="right" w:leader="dot" w:pos="7921"/>
+            </w:tabs>
+            <w:rPr>
+              <w:rFonts w:asciiTheme="minorHAnsi" w:eastAsiaTheme="minorEastAsia" w:hAnsiTheme="minorHAnsi" w:cstheme="minorBidi"/>
+              <w:noProof/>
+              <w:kern w:val="2"/>
+              <w:sz w:val="24"/>
+              <w:szCs w:val="24"/>
+              <w:lang w:val="en-ID" w:eastAsia="en-ID"/>
+              <w14:ligatures w14:val="standardContextual"/>
+            </w:rPr>
+          </w:pPr>
+          <w:hyperlink w:anchor="_Toc229519382" w:history="1">
+            <w:r>
+              <w:rPr>
+                <w:rStyle w:val="Hyperlink"/>
+                <w:noProof/>
+              </w:rPr>
+              <w:t>2.2.</w:t>
+            </w:r>
+            <w:r>
+              <w:rPr>
+                <w:rFonts w:asciiTheme="minorHAnsi" w:eastAsiaTheme="minorEastAsia" w:hAnsiTheme="minorHAnsi" w:cstheme="minorBidi"/>
+                <w:noProof/>
+                <w:kern w:val="2"/>
+                <w:sz w:val="24"/>
+                <w:szCs w:val="24"/>
+                <w:lang w:val="en-ID" w:eastAsia="en-ID"/>
+                <w14:ligatures w14:val="standardContextual"/>
+              </w:rPr>
+              <w:tab/>
+            </w:r>
+            <w:r>
+              <w:rPr>
+                <w:rStyle w:val="Hyperlink"/>
+                <w:noProof/>
+              </w:rPr>
+              <w:t>Penelitian Simulasi dan Desain Interior Digital</w:t>
+            </w:r>
+            <w:r>
+              <w:rPr>
+                <w:noProof/>
+                <w:webHidden/>
+              </w:rPr>
+              <w:tab/>
+            </w:r>
+            <w:r>
+              <w:rPr>
+                <w:noProof/>
+                <w:webHidden/>
+              </w:rPr>
+              <w:fldChar w:fldCharType="begin"/>
+            </w:r>
+            <w:r>
+              <w:rPr>
+                <w:noProof/>
+                <w:webHidden/>
+              </w:rPr>
+              <w:instrText xml:space="preserve"> PAGEREF _Toc229519382 \h </w:instrText>
             </w:r>
             <w:r>
               <w:rPr>
@@ -3403,195 +3591,7 @@
               <w14:ligatures w14:val="standardContextual"/>
             </w:rPr>
           </w:pPr>
-          <w:hyperlink w:anchor="_Toc229427083" w:history="1">
-            <w:r>
-              <w:rPr>
-                <w:rStyle w:val="Hyperlink"/>
-                <w:noProof/>
-              </w:rPr>
-              <w:t xml:space="preserve">2.1. </w:t>
-            </w:r>
-            <w:r>
-              <w:rPr>
-                <w:rFonts w:asciiTheme="minorHAnsi" w:eastAsiaTheme="minorEastAsia" w:hAnsiTheme="minorHAnsi" w:cstheme="minorBidi"/>
-                <w:noProof/>
-                <w:kern w:val="2"/>
-                <w:sz w:val="24"/>
-                <w:szCs w:val="24"/>
-                <w:lang w:val="en-ID" w:eastAsia="en-ID"/>
-                <w14:ligatures w14:val="standardContextual"/>
-              </w:rPr>
-              <w:tab/>
-            </w:r>
-            <w:r>
-              <w:rPr>
-                <w:rStyle w:val="Hyperlink"/>
-                <w:noProof/>
-              </w:rPr>
-              <w:t>Game Simulasi sebagai Media Edukasi Interior</w:t>
-            </w:r>
-            <w:r>
-              <w:rPr>
-                <w:noProof/>
-                <w:webHidden/>
-              </w:rPr>
-              <w:tab/>
-            </w:r>
-            <w:r>
-              <w:rPr>
-                <w:noProof/>
-                <w:webHidden/>
-              </w:rPr>
-              <w:fldChar w:fldCharType="begin"/>
-            </w:r>
-            <w:r>
-              <w:rPr>
-                <w:noProof/>
-                <w:webHidden/>
-              </w:rPr>
-              <w:instrText xml:space="preserve"> PAGEREF _Toc229427083 \h </w:instrText>
-            </w:r>
-            <w:r>
-              <w:rPr>
-                <w:noProof/>
-                <w:webHidden/>
-              </w:rPr>
-            </w:r>
-            <w:r>
-              <w:rPr>
-                <w:noProof/>
-                <w:webHidden/>
-              </w:rPr>
-              <w:fldChar w:fldCharType="separate"/>
-            </w:r>
-            <w:r>
-              <w:rPr>
-                <w:noProof/>
-                <w:webHidden/>
-              </w:rPr>
-              <w:t>6</w:t>
-            </w:r>
-            <w:r>
-              <w:rPr>
-                <w:noProof/>
-                <w:webHidden/>
-              </w:rPr>
-              <w:fldChar w:fldCharType="end"/>
-            </w:r>
-          </w:hyperlink>
-        </w:p>
-        <w:p>
-          <w:pPr>
-            <w:pStyle w:val="TOC2"/>
-            <w:tabs>
-              <w:tab w:val="left" w:pos="960"/>
-              <w:tab w:val="right" w:leader="dot" w:pos="7921"/>
-            </w:tabs>
-            <w:rPr>
-              <w:rFonts w:asciiTheme="minorHAnsi" w:eastAsiaTheme="minorEastAsia" w:hAnsiTheme="minorHAnsi" w:cstheme="minorBidi"/>
-              <w:noProof/>
-              <w:kern w:val="2"/>
-              <w:sz w:val="24"/>
-              <w:szCs w:val="24"/>
-              <w:lang w:val="en-ID" w:eastAsia="en-ID"/>
-              <w14:ligatures w14:val="standardContextual"/>
-            </w:rPr>
-          </w:pPr>
-          <w:hyperlink w:anchor="_Toc229427084" w:history="1">
-            <w:r>
-              <w:rPr>
-                <w:rStyle w:val="Hyperlink"/>
-                <w:noProof/>
-              </w:rPr>
-              <w:t>2.2.</w:t>
-            </w:r>
-            <w:r>
-              <w:rPr>
-                <w:rFonts w:asciiTheme="minorHAnsi" w:eastAsiaTheme="minorEastAsia" w:hAnsiTheme="minorHAnsi" w:cstheme="minorBidi"/>
-                <w:noProof/>
-                <w:kern w:val="2"/>
-                <w:sz w:val="24"/>
-                <w:szCs w:val="24"/>
-                <w:lang w:val="en-ID" w:eastAsia="en-ID"/>
-                <w14:ligatures w14:val="standardContextual"/>
-              </w:rPr>
-              <w:tab/>
-            </w:r>
-            <w:r>
-              <w:rPr>
-                <w:rStyle w:val="Hyperlink"/>
-                <w:noProof/>
-              </w:rPr>
-              <w:t>Penelitian Simulasi dan Desain Interior Digital</w:t>
-            </w:r>
-            <w:r>
-              <w:rPr>
-                <w:noProof/>
-                <w:webHidden/>
-              </w:rPr>
-              <w:tab/>
-            </w:r>
-            <w:r>
-              <w:rPr>
-                <w:noProof/>
-                <w:webHidden/>
-              </w:rPr>
-              <w:fldChar w:fldCharType="begin"/>
-            </w:r>
-            <w:r>
-              <w:rPr>
-                <w:noProof/>
-                <w:webHidden/>
-              </w:rPr>
-              <w:instrText xml:space="preserve"> PAGEREF _Toc229427084 \h </w:instrText>
-            </w:r>
-            <w:r>
-              <w:rPr>
-                <w:noProof/>
-                <w:webHidden/>
-              </w:rPr>
-            </w:r>
-            <w:r>
-              <w:rPr>
-                <w:noProof/>
-                <w:webHidden/>
-              </w:rPr>
-              <w:fldChar w:fldCharType="separate"/>
-            </w:r>
-            <w:r>
-              <w:rPr>
-                <w:noProof/>
-                <w:webHidden/>
-              </w:rPr>
-              <w:t>7</w:t>
-            </w:r>
-            <w:r>
-              <w:rPr>
-                <w:noProof/>
-                <w:webHidden/>
-              </w:rPr>
-              <w:fldChar w:fldCharType="end"/>
-            </w:r>
-          </w:hyperlink>
-        </w:p>
-        <w:p>
-          <w:pPr>
-            <w:pStyle w:val="TOC2"/>
-            <w:tabs>
-              <w:tab w:val="left" w:pos="960"/>
-              <w:tab w:val="right" w:leader="dot" w:pos="7921"/>
-            </w:tabs>
-            <w:rPr>
-              <w:rFonts w:asciiTheme="minorHAnsi" w:eastAsiaTheme="minorEastAsia" w:hAnsiTheme="minorHAnsi" w:cstheme="minorBidi"/>
-              <w:noProof/>
-              <w:kern w:val="2"/>
-              <w:sz w:val="24"/>
-              <w:szCs w:val="24"/>
-              <w:lang w:val="en-ID" w:eastAsia="en-ID"/>
-              <w14:ligatures w14:val="standardContextual"/>
-            </w:rPr>
-          </w:pPr>
-          <w:hyperlink w:anchor="_Toc229427085" w:history="1">
+          <w:hyperlink w:anchor="_Toc229519383" w:history="1">
             <w:r>
               <w:rPr>
                 <w:rStyle w:val="Hyperlink"/>
@@ -3653,7 +3653,7 @@
                 <w:noProof/>
                 <w:webHidden/>
               </w:rPr>
-              <w:instrText xml:space="preserve"> PAGEREF _Toc229427085 \h </w:instrText>
+              <w:instrText xml:space="preserve"> PAGEREF _Toc229519383 \h </w:instrText>
             </w:r>
             <w:r>
               <w:rPr>
@@ -3673,7 +3673,7 @@
                 <w:noProof/>
                 <w:webHidden/>
               </w:rPr>
-              <w:t>9</w:t>
+              <w:t>8</w:t>
             </w:r>
             <w:r>
               <w:rPr>
@@ -3701,7 +3701,7 @@
               <w14:ligatures w14:val="standardContextual"/>
             </w:rPr>
           </w:pPr>
-          <w:hyperlink w:anchor="_Toc229427086" w:history="1">
+          <w:hyperlink w:anchor="_Toc229519384" w:history="1">
             <w:r>
               <w:rPr>
                 <w:rStyle w:val="Hyperlink"/>
@@ -3747,7 +3747,199 @@
                 <w:noProof/>
                 <w:webHidden/>
               </w:rPr>
-              <w:instrText xml:space="preserve"> PAGEREF _Toc229427086 \h </w:instrText>
+              <w:instrText xml:space="preserve"> PAGEREF _Toc229519384 \h </w:instrText>
+            </w:r>
+            <w:r>
+              <w:rPr>
+                <w:noProof/>
+                <w:webHidden/>
+              </w:rPr>
+            </w:r>
+            <w:r>
+              <w:rPr>
+                <w:noProof/>
+                <w:webHidden/>
+              </w:rPr>
+              <w:fldChar w:fldCharType="separate"/>
+            </w:r>
+            <w:r>
+              <w:rPr>
+                <w:noProof/>
+                <w:webHidden/>
+              </w:rPr>
+              <w:t>10</w:t>
+            </w:r>
+            <w:r>
+              <w:rPr>
+                <w:noProof/>
+                <w:webHidden/>
+              </w:rPr>
+              <w:fldChar w:fldCharType="end"/>
+            </w:r>
+          </w:hyperlink>
+        </w:p>
+        <w:p>
+          <w:pPr>
+            <w:pStyle w:val="TOC3"/>
+            <w:tabs>
+              <w:tab w:val="left" w:pos="1200"/>
+              <w:tab w:val="right" w:leader="dot" w:pos="7921"/>
+            </w:tabs>
+            <w:rPr>
+              <w:rFonts w:asciiTheme="minorHAnsi" w:eastAsiaTheme="minorEastAsia" w:hAnsiTheme="minorHAnsi" w:cstheme="minorBidi"/>
+              <w:noProof/>
+              <w:kern w:val="2"/>
+              <w:sz w:val="24"/>
+              <w:szCs w:val="24"/>
+              <w:lang w:val="en-ID" w:eastAsia="en-ID"/>
+              <w14:ligatures w14:val="standardContextual"/>
+            </w:rPr>
+          </w:pPr>
+          <w:hyperlink w:anchor="_Toc229519385" w:history="1">
+            <w:r>
+              <w:rPr>
+                <w:rStyle w:val="Hyperlink"/>
+                <w:noProof/>
+              </w:rPr>
+              <w:t>2.4.1.</w:t>
+            </w:r>
+            <w:r>
+              <w:rPr>
+                <w:rFonts w:asciiTheme="minorHAnsi" w:eastAsiaTheme="minorEastAsia" w:hAnsiTheme="minorHAnsi" w:cstheme="minorBidi"/>
+                <w:noProof/>
+                <w:kern w:val="2"/>
+                <w:sz w:val="24"/>
+                <w:szCs w:val="24"/>
+                <w:lang w:val="en-ID" w:eastAsia="en-ID"/>
+                <w14:ligatures w14:val="standardContextual"/>
+              </w:rPr>
+              <w:tab/>
+            </w:r>
+            <w:r>
+              <w:rPr>
+                <w:rStyle w:val="Hyperlink"/>
+                <w:i/>
+                <w:iCs/>
+                <w:noProof/>
+              </w:rPr>
+              <w:t>House Flipper</w:t>
+            </w:r>
+            <w:r>
+              <w:rPr>
+                <w:noProof/>
+                <w:webHidden/>
+              </w:rPr>
+              <w:tab/>
+            </w:r>
+            <w:r>
+              <w:rPr>
+                <w:noProof/>
+                <w:webHidden/>
+              </w:rPr>
+              <w:fldChar w:fldCharType="begin"/>
+            </w:r>
+            <w:r>
+              <w:rPr>
+                <w:noProof/>
+                <w:webHidden/>
+              </w:rPr>
+              <w:instrText xml:space="preserve"> PAGEREF _Toc229519385 \h </w:instrText>
+            </w:r>
+            <w:r>
+              <w:rPr>
+                <w:noProof/>
+                <w:webHidden/>
+              </w:rPr>
+            </w:r>
+            <w:r>
+              <w:rPr>
+                <w:noProof/>
+                <w:webHidden/>
+              </w:rPr>
+              <w:fldChar w:fldCharType="separate"/>
+            </w:r>
+            <w:r>
+              <w:rPr>
+                <w:noProof/>
+                <w:webHidden/>
+              </w:rPr>
+              <w:t>10</w:t>
+            </w:r>
+            <w:r>
+              <w:rPr>
+                <w:noProof/>
+                <w:webHidden/>
+              </w:rPr>
+              <w:fldChar w:fldCharType="end"/>
+            </w:r>
+          </w:hyperlink>
+        </w:p>
+        <w:p>
+          <w:pPr>
+            <w:pStyle w:val="TOC3"/>
+            <w:tabs>
+              <w:tab w:val="left" w:pos="1200"/>
+              <w:tab w:val="right" w:leader="dot" w:pos="7921"/>
+            </w:tabs>
+            <w:rPr>
+              <w:rFonts w:asciiTheme="minorHAnsi" w:eastAsiaTheme="minorEastAsia" w:hAnsiTheme="minorHAnsi" w:cstheme="minorBidi"/>
+              <w:noProof/>
+              <w:kern w:val="2"/>
+              <w:sz w:val="24"/>
+              <w:szCs w:val="24"/>
+              <w:lang w:val="en-ID" w:eastAsia="en-ID"/>
+              <w14:ligatures w14:val="standardContextual"/>
+            </w:rPr>
+          </w:pPr>
+          <w:hyperlink w:anchor="_Toc229519386" w:history="1">
+            <w:r>
+              <w:rPr>
+                <w:rStyle w:val="Hyperlink"/>
+                <w:noProof/>
+              </w:rPr>
+              <w:t>2.4.2.</w:t>
+            </w:r>
+            <w:r>
+              <w:rPr>
+                <w:rFonts w:asciiTheme="minorHAnsi" w:eastAsiaTheme="minorEastAsia" w:hAnsiTheme="minorHAnsi" w:cstheme="minorBidi"/>
+                <w:noProof/>
+                <w:kern w:val="2"/>
+                <w:sz w:val="24"/>
+                <w:szCs w:val="24"/>
+                <w:lang w:val="en-ID" w:eastAsia="en-ID"/>
+                <w14:ligatures w14:val="standardContextual"/>
+              </w:rPr>
+              <w:tab/>
+            </w:r>
+            <w:r>
+              <w:rPr>
+                <w:rStyle w:val="Hyperlink"/>
+                <w:i/>
+                <w:iCs/>
+                <w:noProof/>
+              </w:rPr>
+              <w:t>The Sims 4</w:t>
+            </w:r>
+            <w:r>
+              <w:rPr>
+                <w:noProof/>
+                <w:webHidden/>
+              </w:rPr>
+              <w:tab/>
+            </w:r>
+            <w:r>
+              <w:rPr>
+                <w:noProof/>
+                <w:webHidden/>
+              </w:rPr>
+              <w:fldChar w:fldCharType="begin"/>
+            </w:r>
+            <w:r>
+              <w:rPr>
+                <w:noProof/>
+                <w:webHidden/>
+              </w:rPr>
+              <w:instrText xml:space="preserve"> PAGEREF _Toc229519386 \h </w:instrText>
             </w:r>
             <w:r>
               <w:rPr>
@@ -3795,13 +3987,13 @@
               <w14:ligatures w14:val="standardContextual"/>
             </w:rPr>
           </w:pPr>
-          <w:hyperlink w:anchor="_Toc229427087" w:history="1">
+          <w:hyperlink w:anchor="_Toc229519387" w:history="1">
             <w:r>
               <w:rPr>
                 <w:rStyle w:val="Hyperlink"/>
                 <w:noProof/>
               </w:rPr>
-              <w:t>2.4.1.</w:t>
+              <w:t>2.4.3.</w:t>
             </w:r>
             <w:r>
               <w:rPr>
@@ -3822,7 +4014,7 @@
                 <w:iCs/>
                 <w:noProof/>
               </w:rPr>
-              <w:t>House Flipper</w:t>
+              <w:t>Planner 5D</w:t>
             </w:r>
             <w:r>
               <w:rPr>
@@ -3843,7 +4035,7 @@
                 <w:noProof/>
                 <w:webHidden/>
               </w:rPr>
-              <w:instrText xml:space="preserve"> PAGEREF _Toc229427087 \h </w:instrText>
+              <w:instrText xml:space="preserve"> PAGEREF _Toc229519387 \h </w:instrText>
             </w:r>
             <w:r>
               <w:rPr>
@@ -3891,199 +4083,7 @@
               <w14:ligatures w14:val="standardContextual"/>
             </w:rPr>
           </w:pPr>
-          <w:hyperlink w:anchor="_Toc229427088" w:history="1">
-            <w:r>
-              <w:rPr>
-                <w:rStyle w:val="Hyperlink"/>
-                <w:noProof/>
-              </w:rPr>
-              <w:t>2.4.2.</w:t>
-            </w:r>
-            <w:r>
-              <w:rPr>
-                <w:rFonts w:asciiTheme="minorHAnsi" w:eastAsiaTheme="minorEastAsia" w:hAnsiTheme="minorHAnsi" w:cstheme="minorBidi"/>
-                <w:noProof/>
-                <w:kern w:val="2"/>
-                <w:sz w:val="24"/>
-                <w:szCs w:val="24"/>
-                <w:lang w:val="en-ID" w:eastAsia="en-ID"/>
-                <w14:ligatures w14:val="standardContextual"/>
-              </w:rPr>
-              <w:tab/>
-            </w:r>
-            <w:r>
-              <w:rPr>
-                <w:rStyle w:val="Hyperlink"/>
-                <w:i/>
-                <w:iCs/>
-                <w:noProof/>
-              </w:rPr>
-              <w:t>The Sims 4</w:t>
-            </w:r>
-            <w:r>
-              <w:rPr>
-                <w:noProof/>
-                <w:webHidden/>
-              </w:rPr>
-              <w:tab/>
-            </w:r>
-            <w:r>
-              <w:rPr>
-                <w:noProof/>
-                <w:webHidden/>
-              </w:rPr>
-              <w:fldChar w:fldCharType="begin"/>
-            </w:r>
-            <w:r>
-              <w:rPr>
-                <w:noProof/>
-                <w:webHidden/>
-              </w:rPr>
-              <w:instrText xml:space="preserve"> PAGEREF _Toc229427088 \h </w:instrText>
-            </w:r>
-            <w:r>
-              <w:rPr>
-                <w:noProof/>
-                <w:webHidden/>
-              </w:rPr>
-            </w:r>
-            <w:r>
-              <w:rPr>
-                <w:noProof/>
-                <w:webHidden/>
-              </w:rPr>
-              <w:fldChar w:fldCharType="separate"/>
-            </w:r>
-            <w:r>
-              <w:rPr>
-                <w:noProof/>
-                <w:webHidden/>
-              </w:rPr>
-              <w:t>12</w:t>
-            </w:r>
-            <w:r>
-              <w:rPr>
-                <w:noProof/>
-                <w:webHidden/>
-              </w:rPr>
-              <w:fldChar w:fldCharType="end"/>
-            </w:r>
-          </w:hyperlink>
-        </w:p>
-        <w:p>
-          <w:pPr>
-            <w:pStyle w:val="TOC3"/>
-            <w:tabs>
-              <w:tab w:val="left" w:pos="1200"/>
-              <w:tab w:val="right" w:leader="dot" w:pos="7921"/>
-            </w:tabs>
-            <w:rPr>
-              <w:rFonts w:asciiTheme="minorHAnsi" w:eastAsiaTheme="minorEastAsia" w:hAnsiTheme="minorHAnsi" w:cstheme="minorBidi"/>
-              <w:noProof/>
-              <w:kern w:val="2"/>
-              <w:sz w:val="24"/>
-              <w:szCs w:val="24"/>
-              <w:lang w:val="en-ID" w:eastAsia="en-ID"/>
-              <w14:ligatures w14:val="standardContextual"/>
-            </w:rPr>
-          </w:pPr>
-          <w:hyperlink w:anchor="_Toc229427089" w:history="1">
-            <w:r>
-              <w:rPr>
-                <w:rStyle w:val="Hyperlink"/>
-                <w:noProof/>
-              </w:rPr>
-              <w:t>2.4.3.</w:t>
-            </w:r>
-            <w:r>
-              <w:rPr>
-                <w:rFonts w:asciiTheme="minorHAnsi" w:eastAsiaTheme="minorEastAsia" w:hAnsiTheme="minorHAnsi" w:cstheme="minorBidi"/>
-                <w:noProof/>
-                <w:kern w:val="2"/>
-                <w:sz w:val="24"/>
-                <w:szCs w:val="24"/>
-                <w:lang w:val="en-ID" w:eastAsia="en-ID"/>
-                <w14:ligatures w14:val="standardContextual"/>
-              </w:rPr>
-              <w:tab/>
-            </w:r>
-            <w:r>
-              <w:rPr>
-                <w:rStyle w:val="Hyperlink"/>
-                <w:i/>
-                <w:iCs/>
-                <w:noProof/>
-              </w:rPr>
-              <w:t>Planner 5D</w:t>
-            </w:r>
-            <w:r>
-              <w:rPr>
-                <w:noProof/>
-                <w:webHidden/>
-              </w:rPr>
-              <w:tab/>
-            </w:r>
-            <w:r>
-              <w:rPr>
-                <w:noProof/>
-                <w:webHidden/>
-              </w:rPr>
-              <w:fldChar w:fldCharType="begin"/>
-            </w:r>
-            <w:r>
-              <w:rPr>
-                <w:noProof/>
-                <w:webHidden/>
-              </w:rPr>
-              <w:instrText xml:space="preserve"> PAGEREF _Toc229427089 \h </w:instrText>
-            </w:r>
-            <w:r>
-              <w:rPr>
-                <w:noProof/>
-                <w:webHidden/>
-              </w:rPr>
-            </w:r>
-            <w:r>
-              <w:rPr>
-                <w:noProof/>
-                <w:webHidden/>
-              </w:rPr>
-              <w:fldChar w:fldCharType="separate"/>
-            </w:r>
-            <w:r>
-              <w:rPr>
-                <w:noProof/>
-                <w:webHidden/>
-              </w:rPr>
-              <w:t>12</w:t>
-            </w:r>
-            <w:r>
-              <w:rPr>
-                <w:noProof/>
-                <w:webHidden/>
-              </w:rPr>
-              <w:fldChar w:fldCharType="end"/>
-            </w:r>
-          </w:hyperlink>
-        </w:p>
-        <w:p>
-          <w:pPr>
-            <w:pStyle w:val="TOC3"/>
-            <w:tabs>
-              <w:tab w:val="left" w:pos="1200"/>
-              <w:tab w:val="right" w:leader="dot" w:pos="7921"/>
-            </w:tabs>
-            <w:rPr>
-              <w:rFonts w:asciiTheme="minorHAnsi" w:eastAsiaTheme="minorEastAsia" w:hAnsiTheme="minorHAnsi" w:cstheme="minorBidi"/>
-              <w:noProof/>
-              <w:kern w:val="2"/>
-              <w:sz w:val="24"/>
-              <w:szCs w:val="24"/>
-              <w:lang w:val="en-ID" w:eastAsia="en-ID"/>
-              <w14:ligatures w14:val="standardContextual"/>
-            </w:rPr>
-          </w:pPr>
-          <w:hyperlink w:anchor="_Toc229427090" w:history="1">
+          <w:hyperlink w:anchor="_Toc229519388" w:history="1">
             <w:r>
               <w:rPr>
                 <w:rStyle w:val="Hyperlink"/>
@@ -4129,7 +4129,7 @@
                 <w:noProof/>
                 <w:webHidden/>
               </w:rPr>
-              <w:instrText xml:space="preserve"> PAGEREF _Toc229427090 \h </w:instrText>
+              <w:instrText xml:space="preserve"> PAGEREF _Toc229519388 \h </w:instrText>
             </w:r>
             <w:r>
               <w:rPr>
@@ -4149,7 +4149,7 @@
                 <w:noProof/>
                 <w:webHidden/>
               </w:rPr>
-              <w:t>13</w:t>
+              <w:t>12</w:t>
             </w:r>
             <w:r>
               <w:rPr>
@@ -4177,7 +4177,7 @@
               <w14:ligatures w14:val="standardContextual"/>
             </w:rPr>
           </w:pPr>
-          <w:hyperlink w:anchor="_Toc229427091" w:history="1">
+          <w:hyperlink w:anchor="_Toc229519389" w:history="1">
             <w:r>
               <w:rPr>
                 <w:rStyle w:val="Hyperlink"/>
@@ -4223,7 +4223,78 @@
                 <w:noProof/>
                 <w:webHidden/>
               </w:rPr>
-              <w:instrText xml:space="preserve"> PAGEREF _Toc229427091 \h </w:instrText>
+              <w:instrText xml:space="preserve"> PAGEREF _Toc229519389 \h </w:instrText>
+            </w:r>
+            <w:r>
+              <w:rPr>
+                <w:noProof/>
+                <w:webHidden/>
+              </w:rPr>
+            </w:r>
+            <w:r>
+              <w:rPr>
+                <w:noProof/>
+                <w:webHidden/>
+              </w:rPr>
+              <w:fldChar w:fldCharType="separate"/>
+            </w:r>
+            <w:r>
+              <w:rPr>
+                <w:noProof/>
+                <w:webHidden/>
+              </w:rPr>
+              <w:t>13</w:t>
+            </w:r>
+            <w:r>
+              <w:rPr>
+                <w:noProof/>
+                <w:webHidden/>
+              </w:rPr>
+              <w:fldChar w:fldCharType="end"/>
+            </w:r>
+          </w:hyperlink>
+        </w:p>
+        <w:p>
+          <w:pPr>
+            <w:pStyle w:val="TOC1"/>
+            <w:rPr>
+              <w:rFonts w:asciiTheme="minorHAnsi" w:eastAsiaTheme="minorEastAsia" w:hAnsiTheme="minorHAnsi" w:cstheme="minorBidi"/>
+              <w:noProof/>
+              <w:kern w:val="2"/>
+              <w:sz w:val="24"/>
+              <w:szCs w:val="24"/>
+              <w:lang w:val="en-ID" w:eastAsia="en-ID"/>
+              <w14:ligatures w14:val="standardContextual"/>
+            </w:rPr>
+          </w:pPr>
+          <w:hyperlink w:anchor="_Toc229519390" w:history="1">
+            <w:r>
+              <w:rPr>
+                <w:rStyle w:val="Hyperlink"/>
+                <w:noProof/>
+              </w:rPr>
+              <w:t>BAB III</w:t>
+            </w:r>
+            <w:r>
+              <w:rPr>
+                <w:noProof/>
+                <w:webHidden/>
+              </w:rPr>
+              <w:tab/>
+            </w:r>
+            <w:r>
+              <w:rPr>
+                <w:noProof/>
+                <w:webHidden/>
+              </w:rPr>
+              <w:fldChar w:fldCharType="begin"/>
+            </w:r>
+            <w:r>
+              <w:rPr>
+                <w:noProof/>
+                <w:webHidden/>
+              </w:rPr>
+              <w:instrText xml:space="preserve"> PAGEREF _Toc229519390 \h </w:instrText>
             </w:r>
             <w:r>
               <w:rPr>
@@ -4267,78 +4338,7 @@
               <w14:ligatures w14:val="standardContextual"/>
             </w:rPr>
           </w:pPr>
-          <w:hyperlink w:anchor="_Toc229427092" w:history="1">
-            <w:r>
-              <w:rPr>
-                <w:rStyle w:val="Hyperlink"/>
-                <w:noProof/>
-              </w:rPr>
-              <w:t>BAB III</w:t>
-            </w:r>
-            <w:r>
-              <w:rPr>
-                <w:noProof/>
-                <w:webHidden/>
-              </w:rPr>
-              <w:tab/>
-            </w:r>
-            <w:r>
-              <w:rPr>
-                <w:noProof/>
-                <w:webHidden/>
-              </w:rPr>
-              <w:fldChar w:fldCharType="begin"/>
-            </w:r>
-            <w:r>
-              <w:rPr>
-                <w:noProof/>
-                <w:webHidden/>
-              </w:rPr>
-              <w:instrText xml:space="preserve"> PAGEREF _Toc229427092 \h </w:instrText>
-            </w:r>
-            <w:r>
-              <w:rPr>
-                <w:noProof/>
-                <w:webHidden/>
-              </w:rPr>
-            </w:r>
-            <w:r>
-              <w:rPr>
-                <w:noProof/>
-                <w:webHidden/>
-              </w:rPr>
-              <w:fldChar w:fldCharType="separate"/>
-            </w:r>
-            <w:r>
-              <w:rPr>
-                <w:noProof/>
-                <w:webHidden/>
-              </w:rPr>
-              <w:t>15</w:t>
-            </w:r>
-            <w:r>
-              <w:rPr>
-                <w:noProof/>
-                <w:webHidden/>
-              </w:rPr>
-              <w:fldChar w:fldCharType="end"/>
-            </w:r>
-          </w:hyperlink>
-        </w:p>
-        <w:p>
-          <w:pPr>
-            <w:pStyle w:val="TOC1"/>
-            <w:rPr>
-              <w:rFonts w:asciiTheme="minorHAnsi" w:eastAsiaTheme="minorEastAsia" w:hAnsiTheme="minorHAnsi" w:cstheme="minorBidi"/>
-              <w:noProof/>
-              <w:kern w:val="2"/>
-              <w:sz w:val="24"/>
-              <w:szCs w:val="24"/>
-              <w:lang w:val="en-ID" w:eastAsia="en-ID"/>
-              <w14:ligatures w14:val="standardContextual"/>
-            </w:rPr>
-          </w:pPr>
-          <w:hyperlink w:anchor="_Toc229427093" w:history="1">
+          <w:hyperlink w:anchor="_Toc229519391" w:history="1">
             <w:r>
               <w:rPr>
                 <w:rStyle w:val="Hyperlink"/>
@@ -4365,7 +4365,7 @@
                 <w:noProof/>
                 <w:webHidden/>
               </w:rPr>
-              <w:instrText xml:space="preserve"> PAGEREF _Toc229427093 \h </w:instrText>
+              <w:instrText xml:space="preserve"> PAGEREF _Toc229519391 \h </w:instrText>
             </w:r>
             <w:r>
               <w:rPr>
@@ -4385,7 +4385,7 @@
                 <w:noProof/>
                 <w:webHidden/>
               </w:rPr>
-              <w:t>15</w:t>
+              <w:t>14</w:t>
             </w:r>
             <w:r>
               <w:rPr>
@@ -4413,7 +4413,7 @@
               <w14:ligatures w14:val="standardContextual"/>
             </w:rPr>
           </w:pPr>
-          <w:hyperlink w:anchor="_Toc229427094" w:history="1">
+          <w:hyperlink w:anchor="_Toc229519392" w:history="1">
             <w:r>
               <w:rPr>
                 <w:rStyle w:val="Hyperlink"/>
@@ -4438,7 +4438,7 @@
                 <w:rStyle w:val="Hyperlink"/>
                 <w:noProof/>
               </w:rPr>
-              <w:t>Deskripsi Umum</w:t>
+              <w:t>Deskripsi Umum Penelitian</w:t>
             </w:r>
             <w:r>
               <w:rPr>
@@ -4459,7 +4459,7 @@
                 <w:noProof/>
                 <w:webHidden/>
               </w:rPr>
-              <w:instrText xml:space="preserve"> PAGEREF _Toc229427094 \h </w:instrText>
+              <w:instrText xml:space="preserve"> PAGEREF _Toc229519392 \h </w:instrText>
             </w:r>
             <w:r>
               <w:rPr>
@@ -4479,7 +4479,7 @@
                 <w:noProof/>
                 <w:webHidden/>
               </w:rPr>
-              <w:t>15</w:t>
+              <w:t>14</w:t>
             </w:r>
             <w:r>
               <w:rPr>
@@ -4507,7 +4507,7 @@
               <w14:ligatures w14:val="standardContextual"/>
             </w:rPr>
           </w:pPr>
-          <w:hyperlink w:anchor="_Toc229427095" w:history="1">
+          <w:hyperlink w:anchor="_Toc229519393" w:history="1">
             <w:r>
               <w:rPr>
                 <w:rStyle w:val="Hyperlink"/>
@@ -4532,7 +4532,7 @@
                 <w:rStyle w:val="Hyperlink"/>
                 <w:noProof/>
               </w:rPr>
-              <w:t>Data</w:t>
+              <w:t>Metodologi Penelitian</w:t>
             </w:r>
             <w:r>
               <w:rPr>
@@ -4553,7 +4553,7 @@
                 <w:noProof/>
                 <w:webHidden/>
               </w:rPr>
-              <w:instrText xml:space="preserve"> PAGEREF _Toc229427095 \h </w:instrText>
+              <w:instrText xml:space="preserve"> PAGEREF _Toc229519393 \h </w:instrText>
             </w:r>
             <w:r>
               <w:rPr>
@@ -4573,7 +4573,7 @@
                 <w:noProof/>
                 <w:webHidden/>
               </w:rPr>
-              <w:t>15</w:t>
+              <w:t>14</w:t>
             </w:r>
             <w:r>
               <w:rPr>
@@ -4586,9 +4586,9 @@
         </w:p>
         <w:p>
           <w:pPr>
-            <w:pStyle w:val="TOC2"/>
+            <w:pStyle w:val="TOC3"/>
             <w:tabs>
-              <w:tab w:val="left" w:pos="960"/>
+              <w:tab w:val="left" w:pos="1200"/>
               <w:tab w:val="right" w:leader="dot" w:pos="7921"/>
             </w:tabs>
             <w:rPr>
@@ -4601,13 +4601,13 @@
               <w14:ligatures w14:val="standardContextual"/>
             </w:rPr>
           </w:pPr>
-          <w:hyperlink w:anchor="_Toc229427096" w:history="1">
+          <w:hyperlink w:anchor="_Toc229519394" w:history="1">
             <w:r>
               <w:rPr>
                 <w:rStyle w:val="Hyperlink"/>
                 <w:noProof/>
               </w:rPr>
-              <w:t>3.3.</w:t>
+              <w:t>3.2.1.</w:t>
             </w:r>
             <w:r>
               <w:rPr>
@@ -4626,7 +4626,7 @@
                 <w:rStyle w:val="Hyperlink"/>
                 <w:noProof/>
               </w:rPr>
-              <w:t>Rancangan Model</w:t>
+              <w:t>Tahap Perencanaan</w:t>
             </w:r>
             <w:r>
               <w:rPr>
@@ -4647,7 +4647,7 @@
                 <w:noProof/>
                 <w:webHidden/>
               </w:rPr>
-              <w:instrText xml:space="preserve"> PAGEREF _Toc229427096 \h </w:instrText>
+              <w:instrText xml:space="preserve"> PAGEREF _Toc229519394 \h </w:instrText>
             </w:r>
             <w:r>
               <w:rPr>
@@ -4667,7 +4667,7 @@
                 <w:noProof/>
                 <w:webHidden/>
               </w:rPr>
-              <w:t>15</w:t>
+              <w:t>14</w:t>
             </w:r>
             <w:r>
               <w:rPr>
@@ -4680,9 +4680,9 @@
         </w:p>
         <w:p>
           <w:pPr>
-            <w:pStyle w:val="TOC2"/>
+            <w:pStyle w:val="TOC3"/>
             <w:tabs>
-              <w:tab w:val="left" w:pos="960"/>
+              <w:tab w:val="left" w:pos="1200"/>
               <w:tab w:val="right" w:leader="dot" w:pos="7921"/>
             </w:tabs>
             <w:rPr>
@@ -4695,13 +4695,13 @@
               <w14:ligatures w14:val="standardContextual"/>
             </w:rPr>
           </w:pPr>
-          <w:hyperlink w:anchor="_Toc229427097" w:history="1">
+          <w:hyperlink w:anchor="_Toc229519395" w:history="1">
             <w:r>
               <w:rPr>
                 <w:rStyle w:val="Hyperlink"/>
                 <w:noProof/>
               </w:rPr>
-              <w:t xml:space="preserve">3.4. </w:t>
+              <w:t>3.2.2.</w:t>
             </w:r>
             <w:r>
               <w:rPr>
@@ -4720,7 +4720,23 @@
                 <w:rStyle w:val="Hyperlink"/>
                 <w:noProof/>
               </w:rPr>
-              <w:t>Rancangan Pengujian dan Analisis</w:t>
+              <w:t xml:space="preserve">Tahap Perancangan </w:t>
+            </w:r>
+            <w:r>
+              <w:rPr>
+                <w:rStyle w:val="Hyperlink"/>
+                <w:i/>
+                <w:iCs/>
+                <w:noProof/>
+              </w:rPr>
+              <w:t>Gameplay</w:t>
+            </w:r>
+            <w:r>
+              <w:rPr>
+                <w:rStyle w:val="Hyperlink"/>
+                <w:noProof/>
+              </w:rPr>
+              <w:t xml:space="preserve"> dan Sistem</w:t>
             </w:r>
             <w:r>
               <w:rPr>
@@ -4741,7 +4757,7 @@
                 <w:noProof/>
                 <w:webHidden/>
               </w:rPr>
-              <w:instrText xml:space="preserve"> PAGEREF _Toc229427097 \h </w:instrText>
+              <w:instrText xml:space="preserve"> PAGEREF _Toc229519395 \h </w:instrText>
             </w:r>
             <w:r>
               <w:rPr>
@@ -4761,7 +4777,580 @@
                 <w:noProof/>
                 <w:webHidden/>
               </w:rPr>
-              <w:t>15</w:t>
+              <w:t>14</w:t>
+            </w:r>
+            <w:r>
+              <w:rPr>
+                <w:noProof/>
+                <w:webHidden/>
+              </w:rPr>
+              <w:fldChar w:fldCharType="end"/>
+            </w:r>
+          </w:hyperlink>
+        </w:p>
+        <w:p>
+          <w:pPr>
+            <w:pStyle w:val="TOC3"/>
+            <w:tabs>
+              <w:tab w:val="left" w:pos="1200"/>
+              <w:tab w:val="right" w:leader="dot" w:pos="7921"/>
+            </w:tabs>
+            <w:rPr>
+              <w:rFonts w:asciiTheme="minorHAnsi" w:eastAsiaTheme="minorEastAsia" w:hAnsiTheme="minorHAnsi" w:cstheme="minorBidi"/>
+              <w:noProof/>
+              <w:kern w:val="2"/>
+              <w:sz w:val="24"/>
+              <w:szCs w:val="24"/>
+              <w:lang w:val="en-ID" w:eastAsia="en-ID"/>
+              <w14:ligatures w14:val="standardContextual"/>
+            </w:rPr>
+          </w:pPr>
+          <w:hyperlink w:anchor="_Toc229519396" w:history="1">
+            <w:r>
+              <w:rPr>
+                <w:rStyle w:val="Hyperlink"/>
+                <w:noProof/>
+              </w:rPr>
+              <w:t>3.2.3.</w:t>
+            </w:r>
+            <w:r>
+              <w:rPr>
+                <w:rFonts w:asciiTheme="minorHAnsi" w:eastAsiaTheme="minorEastAsia" w:hAnsiTheme="minorHAnsi" w:cstheme="minorBidi"/>
+                <w:noProof/>
+                <w:kern w:val="2"/>
+                <w:sz w:val="24"/>
+                <w:szCs w:val="24"/>
+                <w:lang w:val="en-ID" w:eastAsia="en-ID"/>
+                <w14:ligatures w14:val="standardContextual"/>
+              </w:rPr>
+              <w:tab/>
+            </w:r>
+            <w:r>
+              <w:rPr>
+                <w:rStyle w:val="Hyperlink"/>
+                <w:noProof/>
+              </w:rPr>
+              <w:t xml:space="preserve">Tahap Perancangan Mekanisme </w:t>
+            </w:r>
+            <w:r>
+              <w:rPr>
+                <w:rStyle w:val="Hyperlink"/>
+                <w:i/>
+                <w:iCs/>
+                <w:noProof/>
+              </w:rPr>
+              <w:t>Environmental-Spatial Optimization</w:t>
+            </w:r>
+            <w:r>
+              <w:rPr>
+                <w:noProof/>
+                <w:webHidden/>
+              </w:rPr>
+              <w:tab/>
+            </w:r>
+            <w:r>
+              <w:rPr>
+                <w:noProof/>
+                <w:webHidden/>
+              </w:rPr>
+              <w:fldChar w:fldCharType="begin"/>
+            </w:r>
+            <w:r>
+              <w:rPr>
+                <w:noProof/>
+                <w:webHidden/>
+              </w:rPr>
+              <w:instrText xml:space="preserve"> PAGEREF _Toc229519396 \h </w:instrText>
+            </w:r>
+            <w:r>
+              <w:rPr>
+                <w:noProof/>
+                <w:webHidden/>
+              </w:rPr>
+            </w:r>
+            <w:r>
+              <w:rPr>
+                <w:noProof/>
+                <w:webHidden/>
+              </w:rPr>
+              <w:fldChar w:fldCharType="separate"/>
+            </w:r>
+            <w:r>
+              <w:rPr>
+                <w:noProof/>
+                <w:webHidden/>
+              </w:rPr>
+              <w:t>14</w:t>
+            </w:r>
+            <w:r>
+              <w:rPr>
+                <w:noProof/>
+                <w:webHidden/>
+              </w:rPr>
+              <w:fldChar w:fldCharType="end"/>
+            </w:r>
+          </w:hyperlink>
+        </w:p>
+        <w:p>
+          <w:pPr>
+            <w:pStyle w:val="TOC3"/>
+            <w:tabs>
+              <w:tab w:val="left" w:pos="1200"/>
+              <w:tab w:val="right" w:leader="dot" w:pos="7921"/>
+            </w:tabs>
+            <w:rPr>
+              <w:rFonts w:asciiTheme="minorHAnsi" w:eastAsiaTheme="minorEastAsia" w:hAnsiTheme="minorHAnsi" w:cstheme="minorBidi"/>
+              <w:noProof/>
+              <w:kern w:val="2"/>
+              <w:sz w:val="24"/>
+              <w:szCs w:val="24"/>
+              <w:lang w:val="en-ID" w:eastAsia="en-ID"/>
+              <w14:ligatures w14:val="standardContextual"/>
+            </w:rPr>
+          </w:pPr>
+          <w:hyperlink w:anchor="_Toc229519397" w:history="1">
+            <w:r>
+              <w:rPr>
+                <w:rStyle w:val="Hyperlink"/>
+                <w:noProof/>
+              </w:rPr>
+              <w:t>3.2.4.</w:t>
+            </w:r>
+            <w:r>
+              <w:rPr>
+                <w:rFonts w:asciiTheme="minorHAnsi" w:eastAsiaTheme="minorEastAsia" w:hAnsiTheme="minorHAnsi" w:cstheme="minorBidi"/>
+                <w:noProof/>
+                <w:kern w:val="2"/>
+                <w:sz w:val="24"/>
+                <w:szCs w:val="24"/>
+                <w:lang w:val="en-ID" w:eastAsia="en-ID"/>
+                <w14:ligatures w14:val="standardContextual"/>
+              </w:rPr>
+              <w:tab/>
+            </w:r>
+            <w:r>
+              <w:rPr>
+                <w:rStyle w:val="Hyperlink"/>
+                <w:noProof/>
+              </w:rPr>
+              <w:t>Tahap Perancangan UI/UX</w:t>
+            </w:r>
+            <w:r>
+              <w:rPr>
+                <w:noProof/>
+                <w:webHidden/>
+              </w:rPr>
+              <w:tab/>
+            </w:r>
+            <w:r>
+              <w:rPr>
+                <w:noProof/>
+                <w:webHidden/>
+              </w:rPr>
+              <w:fldChar w:fldCharType="begin"/>
+            </w:r>
+            <w:r>
+              <w:rPr>
+                <w:noProof/>
+                <w:webHidden/>
+              </w:rPr>
+              <w:instrText xml:space="preserve"> PAGEREF _Toc229519397 \h </w:instrText>
+            </w:r>
+            <w:r>
+              <w:rPr>
+                <w:noProof/>
+                <w:webHidden/>
+              </w:rPr>
+            </w:r>
+            <w:r>
+              <w:rPr>
+                <w:noProof/>
+                <w:webHidden/>
+              </w:rPr>
+              <w:fldChar w:fldCharType="separate"/>
+            </w:r>
+            <w:r>
+              <w:rPr>
+                <w:noProof/>
+                <w:webHidden/>
+              </w:rPr>
+              <w:t>14</w:t>
+            </w:r>
+            <w:r>
+              <w:rPr>
+                <w:noProof/>
+                <w:webHidden/>
+              </w:rPr>
+              <w:fldChar w:fldCharType="end"/>
+            </w:r>
+          </w:hyperlink>
+        </w:p>
+        <w:p>
+          <w:pPr>
+            <w:pStyle w:val="TOC3"/>
+            <w:tabs>
+              <w:tab w:val="left" w:pos="1200"/>
+              <w:tab w:val="right" w:leader="dot" w:pos="7921"/>
+            </w:tabs>
+            <w:rPr>
+              <w:rFonts w:asciiTheme="minorHAnsi" w:eastAsiaTheme="minorEastAsia" w:hAnsiTheme="minorHAnsi" w:cstheme="minorBidi"/>
+              <w:noProof/>
+              <w:kern w:val="2"/>
+              <w:sz w:val="24"/>
+              <w:szCs w:val="24"/>
+              <w:lang w:val="en-ID" w:eastAsia="en-ID"/>
+              <w14:ligatures w14:val="standardContextual"/>
+            </w:rPr>
+          </w:pPr>
+          <w:hyperlink w:anchor="_Toc229519398" w:history="1">
+            <w:r>
+              <w:rPr>
+                <w:rStyle w:val="Hyperlink"/>
+                <w:noProof/>
+              </w:rPr>
+              <w:t>3.2.5.</w:t>
+            </w:r>
+            <w:r>
+              <w:rPr>
+                <w:rFonts w:asciiTheme="minorHAnsi" w:eastAsiaTheme="minorEastAsia" w:hAnsiTheme="minorHAnsi" w:cstheme="minorBidi"/>
+                <w:noProof/>
+                <w:kern w:val="2"/>
+                <w:sz w:val="24"/>
+                <w:szCs w:val="24"/>
+                <w:lang w:val="en-ID" w:eastAsia="en-ID"/>
+                <w14:ligatures w14:val="standardContextual"/>
+              </w:rPr>
+              <w:tab/>
+            </w:r>
+            <w:r>
+              <w:rPr>
+                <w:rStyle w:val="Hyperlink"/>
+                <w:noProof/>
+              </w:rPr>
+              <w:t>Tahap Implementasi Sistem</w:t>
+            </w:r>
+            <w:r>
+              <w:rPr>
+                <w:noProof/>
+                <w:webHidden/>
+              </w:rPr>
+              <w:tab/>
+            </w:r>
+            <w:r>
+              <w:rPr>
+                <w:noProof/>
+                <w:webHidden/>
+              </w:rPr>
+              <w:fldChar w:fldCharType="begin"/>
+            </w:r>
+            <w:r>
+              <w:rPr>
+                <w:noProof/>
+                <w:webHidden/>
+              </w:rPr>
+              <w:instrText xml:space="preserve"> PAGEREF _Toc229519398 \h </w:instrText>
+            </w:r>
+            <w:r>
+              <w:rPr>
+                <w:noProof/>
+                <w:webHidden/>
+              </w:rPr>
+            </w:r>
+            <w:r>
+              <w:rPr>
+                <w:noProof/>
+                <w:webHidden/>
+              </w:rPr>
+              <w:fldChar w:fldCharType="separate"/>
+            </w:r>
+            <w:r>
+              <w:rPr>
+                <w:noProof/>
+                <w:webHidden/>
+              </w:rPr>
+              <w:t>14</w:t>
+            </w:r>
+            <w:r>
+              <w:rPr>
+                <w:noProof/>
+                <w:webHidden/>
+              </w:rPr>
+              <w:fldChar w:fldCharType="end"/>
+            </w:r>
+          </w:hyperlink>
+        </w:p>
+        <w:p>
+          <w:pPr>
+            <w:pStyle w:val="TOC3"/>
+            <w:tabs>
+              <w:tab w:val="left" w:pos="1200"/>
+              <w:tab w:val="right" w:leader="dot" w:pos="7921"/>
+            </w:tabs>
+            <w:rPr>
+              <w:rFonts w:asciiTheme="minorHAnsi" w:eastAsiaTheme="minorEastAsia" w:hAnsiTheme="minorHAnsi" w:cstheme="minorBidi"/>
+              <w:noProof/>
+              <w:kern w:val="2"/>
+              <w:sz w:val="24"/>
+              <w:szCs w:val="24"/>
+              <w:lang w:val="en-ID" w:eastAsia="en-ID"/>
+              <w14:ligatures w14:val="standardContextual"/>
+            </w:rPr>
+          </w:pPr>
+          <w:hyperlink w:anchor="_Toc229519399" w:history="1">
+            <w:r>
+              <w:rPr>
+                <w:rStyle w:val="Hyperlink"/>
+                <w:noProof/>
+              </w:rPr>
+              <w:t>3.2.6.</w:t>
+            </w:r>
+            <w:r>
+              <w:rPr>
+                <w:rFonts w:asciiTheme="minorHAnsi" w:eastAsiaTheme="minorEastAsia" w:hAnsiTheme="minorHAnsi" w:cstheme="minorBidi"/>
+                <w:noProof/>
+                <w:kern w:val="2"/>
+                <w:sz w:val="24"/>
+                <w:szCs w:val="24"/>
+                <w:lang w:val="en-ID" w:eastAsia="en-ID"/>
+                <w14:ligatures w14:val="standardContextual"/>
+              </w:rPr>
+              <w:tab/>
+            </w:r>
+            <w:r>
+              <w:rPr>
+                <w:rStyle w:val="Hyperlink"/>
+                <w:noProof/>
+              </w:rPr>
+              <w:t>Tahap Pengujian Sistem</w:t>
+            </w:r>
+            <w:r>
+              <w:rPr>
+                <w:noProof/>
+                <w:webHidden/>
+              </w:rPr>
+              <w:tab/>
+            </w:r>
+            <w:r>
+              <w:rPr>
+                <w:noProof/>
+                <w:webHidden/>
+              </w:rPr>
+              <w:fldChar w:fldCharType="begin"/>
+            </w:r>
+            <w:r>
+              <w:rPr>
+                <w:noProof/>
+                <w:webHidden/>
+              </w:rPr>
+              <w:instrText xml:space="preserve"> PAGEREF _Toc229519399 \h </w:instrText>
+            </w:r>
+            <w:r>
+              <w:rPr>
+                <w:noProof/>
+                <w:webHidden/>
+              </w:rPr>
+            </w:r>
+            <w:r>
+              <w:rPr>
+                <w:noProof/>
+                <w:webHidden/>
+              </w:rPr>
+              <w:fldChar w:fldCharType="separate"/>
+            </w:r>
+            <w:r>
+              <w:rPr>
+                <w:noProof/>
+                <w:webHidden/>
+              </w:rPr>
+              <w:t>14</w:t>
+            </w:r>
+            <w:r>
+              <w:rPr>
+                <w:noProof/>
+                <w:webHidden/>
+              </w:rPr>
+              <w:fldChar w:fldCharType="end"/>
+            </w:r>
+          </w:hyperlink>
+        </w:p>
+        <w:p>
+          <w:pPr>
+            <w:pStyle w:val="TOC3"/>
+            <w:tabs>
+              <w:tab w:val="left" w:pos="1200"/>
+              <w:tab w:val="right" w:leader="dot" w:pos="7921"/>
+            </w:tabs>
+            <w:rPr>
+              <w:rFonts w:asciiTheme="minorHAnsi" w:eastAsiaTheme="minorEastAsia" w:hAnsiTheme="minorHAnsi" w:cstheme="minorBidi"/>
+              <w:noProof/>
+              <w:kern w:val="2"/>
+              <w:sz w:val="24"/>
+              <w:szCs w:val="24"/>
+              <w:lang w:val="en-ID" w:eastAsia="en-ID"/>
+              <w14:ligatures w14:val="standardContextual"/>
+            </w:rPr>
+          </w:pPr>
+          <w:hyperlink w:anchor="_Toc229519400" w:history="1">
+            <w:r>
+              <w:rPr>
+                <w:rStyle w:val="Hyperlink"/>
+                <w:noProof/>
+              </w:rPr>
+              <w:t>3.2.7.</w:t>
+            </w:r>
+            <w:r>
+              <w:rPr>
+                <w:rFonts w:asciiTheme="minorHAnsi" w:eastAsiaTheme="minorEastAsia" w:hAnsiTheme="minorHAnsi" w:cstheme="minorBidi"/>
+                <w:noProof/>
+                <w:kern w:val="2"/>
+                <w:sz w:val="24"/>
+                <w:szCs w:val="24"/>
+                <w:lang w:val="en-ID" w:eastAsia="en-ID"/>
+                <w14:ligatures w14:val="standardContextual"/>
+              </w:rPr>
+              <w:tab/>
+            </w:r>
+            <w:r>
+              <w:rPr>
+                <w:rStyle w:val="Hyperlink"/>
+                <w:noProof/>
+              </w:rPr>
+              <w:t>Tahap Pengumpulan dan Analisis Data Pengguna</w:t>
+            </w:r>
+            <w:r>
+              <w:rPr>
+                <w:noProof/>
+                <w:webHidden/>
+              </w:rPr>
+              <w:tab/>
+            </w:r>
+            <w:r>
+              <w:rPr>
+                <w:noProof/>
+                <w:webHidden/>
+              </w:rPr>
+              <w:fldChar w:fldCharType="begin"/>
+            </w:r>
+            <w:r>
+              <w:rPr>
+                <w:noProof/>
+                <w:webHidden/>
+              </w:rPr>
+              <w:instrText xml:space="preserve"> PAGEREF _Toc229519400 \h </w:instrText>
+            </w:r>
+            <w:r>
+              <w:rPr>
+                <w:noProof/>
+                <w:webHidden/>
+              </w:rPr>
+            </w:r>
+            <w:r>
+              <w:rPr>
+                <w:noProof/>
+                <w:webHidden/>
+              </w:rPr>
+              <w:fldChar w:fldCharType="separate"/>
+            </w:r>
+            <w:r>
+              <w:rPr>
+                <w:noProof/>
+                <w:webHidden/>
+              </w:rPr>
+              <w:t>14</w:t>
+            </w:r>
+            <w:r>
+              <w:rPr>
+                <w:noProof/>
+                <w:webHidden/>
+              </w:rPr>
+              <w:fldChar w:fldCharType="end"/>
+            </w:r>
+          </w:hyperlink>
+        </w:p>
+        <w:p>
+          <w:pPr>
+            <w:pStyle w:val="TOC3"/>
+            <w:tabs>
+              <w:tab w:val="left" w:pos="1200"/>
+              <w:tab w:val="right" w:leader="dot" w:pos="7921"/>
+            </w:tabs>
+            <w:rPr>
+              <w:rFonts w:asciiTheme="minorHAnsi" w:eastAsiaTheme="minorEastAsia" w:hAnsiTheme="minorHAnsi" w:cstheme="minorBidi"/>
+              <w:noProof/>
+              <w:kern w:val="2"/>
+              <w:sz w:val="24"/>
+              <w:szCs w:val="24"/>
+              <w:lang w:val="en-ID" w:eastAsia="en-ID"/>
+              <w14:ligatures w14:val="standardContextual"/>
+            </w:rPr>
+          </w:pPr>
+          <w:hyperlink w:anchor="_Toc229519401" w:history="1">
+            <w:r>
+              <w:rPr>
+                <w:rStyle w:val="Hyperlink"/>
+                <w:noProof/>
+              </w:rPr>
+              <w:t>3.2.8.</w:t>
+            </w:r>
+            <w:r>
+              <w:rPr>
+                <w:rFonts w:asciiTheme="minorHAnsi" w:eastAsiaTheme="minorEastAsia" w:hAnsiTheme="minorHAnsi" w:cstheme="minorBidi"/>
+                <w:noProof/>
+                <w:kern w:val="2"/>
+                <w:sz w:val="24"/>
+                <w:szCs w:val="24"/>
+                <w:lang w:val="en-ID" w:eastAsia="en-ID"/>
+                <w14:ligatures w14:val="standardContextual"/>
+              </w:rPr>
+              <w:tab/>
+            </w:r>
+            <w:r>
+              <w:rPr>
+                <w:rStyle w:val="Hyperlink"/>
+                <w:noProof/>
+              </w:rPr>
+              <w:t>Tahap Evaluasi</w:t>
+            </w:r>
+            <w:r>
+              <w:rPr>
+                <w:noProof/>
+                <w:webHidden/>
+              </w:rPr>
+              <w:tab/>
+            </w:r>
+            <w:r>
+              <w:rPr>
+                <w:noProof/>
+                <w:webHidden/>
+              </w:rPr>
+              <w:fldChar w:fldCharType="begin"/>
+            </w:r>
+            <w:r>
+              <w:rPr>
+                <w:noProof/>
+                <w:webHidden/>
+              </w:rPr>
+              <w:instrText xml:space="preserve"> PAGEREF _Toc229519401 \h </w:instrText>
+            </w:r>
+            <w:r>
+              <w:rPr>
+                <w:noProof/>
+                <w:webHidden/>
+              </w:rPr>
+            </w:r>
+            <w:r>
+              <w:rPr>
+                <w:noProof/>
+                <w:webHidden/>
+              </w:rPr>
+              <w:fldChar w:fldCharType="separate"/>
+            </w:r>
+            <w:r>
+              <w:rPr>
+                <w:noProof/>
+                <w:webHidden/>
+              </w:rPr>
+              <w:t>14</w:t>
             </w:r>
             <w:r>
               <w:rPr>
@@ -4785,7 +5374,7 @@
               <w14:ligatures w14:val="standardContextual"/>
             </w:rPr>
           </w:pPr>
-          <w:hyperlink w:anchor="_Toc229427098" w:history="1">
+          <w:hyperlink w:anchor="_Toc229519402" w:history="1">
             <w:r>
               <w:rPr>
                 <w:rStyle w:val="Hyperlink"/>
@@ -4812,7 +5401,7 @@
                 <w:noProof/>
                 <w:webHidden/>
               </w:rPr>
-              <w:instrText xml:space="preserve"> PAGEREF _Toc229427098 \h </w:instrText>
+              <w:instrText xml:space="preserve"> PAGEREF _Toc229519402 \h </w:instrText>
             </w:r>
             <w:r>
               <w:rPr>
@@ -4856,7 +5445,7 @@
               <w14:ligatures w14:val="standardContextual"/>
             </w:rPr>
           </w:pPr>
-          <w:hyperlink w:anchor="_Toc229427099" w:history="1">
+          <w:hyperlink w:anchor="_Toc229519403" w:history="1">
             <w:r>
               <w:rPr>
                 <w:rStyle w:val="Hyperlink"/>
@@ -4883,7 +5472,7 @@
                 <w:noProof/>
                 <w:webHidden/>
               </w:rPr>
-              <w:instrText xml:space="preserve"> PAGEREF _Toc229427099 \h </w:instrText>
+              <w:instrText xml:space="preserve"> PAGEREF _Toc229519403 \h </w:instrText>
             </w:r>
             <w:r>
               <w:rPr>
@@ -4931,7 +5520,7 @@
               <w14:ligatures w14:val="standardContextual"/>
             </w:rPr>
           </w:pPr>
-          <w:hyperlink w:anchor="_Toc229427100" w:history="1">
+          <w:hyperlink w:anchor="_Toc229519404" w:history="1">
             <w:r>
               <w:rPr>
                 <w:rStyle w:val="Hyperlink"/>
@@ -4977,7 +5566,7 @@
                 <w:noProof/>
                 <w:webHidden/>
               </w:rPr>
-              <w:instrText xml:space="preserve"> PAGEREF _Toc229427100 \h </w:instrText>
+              <w:instrText xml:space="preserve"> PAGEREF _Toc229519404 \h </w:instrText>
             </w:r>
             <w:r>
               <w:rPr>
@@ -5021,7 +5610,7 @@
               <w14:ligatures w14:val="standardContextual"/>
             </w:rPr>
           </w:pPr>
-          <w:hyperlink w:anchor="_Toc229427101" w:history="1">
+          <w:hyperlink w:anchor="_Toc229519405" w:history="1">
             <w:r>
               <w:rPr>
                 <w:rStyle w:val="Hyperlink"/>
@@ -5048,7 +5637,7 @@
                 <w:noProof/>
                 <w:webHidden/>
               </w:rPr>
-              <w:instrText xml:space="preserve"> PAGEREF _Toc229427101 \h </w:instrText>
+              <w:instrText xml:space="preserve"> PAGEREF _Toc229519405 \h </w:instrText>
             </w:r>
             <w:r>
               <w:rPr>
@@ -5092,7 +5681,7 @@
               <w14:ligatures w14:val="standardContextual"/>
             </w:rPr>
           </w:pPr>
-          <w:hyperlink w:anchor="_Toc229427102" w:history="1">
+          <w:hyperlink w:anchor="_Toc229519406" w:history="1">
             <w:r>
               <w:rPr>
                 <w:rStyle w:val="Hyperlink"/>
@@ -5119,7 +5708,7 @@
                 <w:noProof/>
                 <w:webHidden/>
               </w:rPr>
-              <w:instrText xml:space="preserve"> PAGEREF _Toc229427102 \h </w:instrText>
+              <w:instrText xml:space="preserve"> PAGEREF _Toc229519406 \h </w:instrText>
             </w:r>
             <w:r>
               <w:rPr>
@@ -5184,9 +5773,8 @@
         </w:numPr>
         <w:ind w:right="-7"/>
       </w:pPr>
-      <w:bookmarkStart w:id="4" w:name="_Toc229427073"/>
-      <w:r>
-        <w:lastRenderedPageBreak/>
+      <w:bookmarkStart w:id="4" w:name="_Toc229519371"/>
+      <w:r>
         <w:t>INTISARI</w:t>
       </w:r>
       <w:bookmarkEnd w:id="4"/>
@@ -5751,12 +6339,11 @@
           <w:i/>
         </w:rPr>
       </w:pPr>
-      <w:bookmarkStart w:id="5" w:name="_Toc229427074"/>
+      <w:bookmarkStart w:id="5" w:name="_Toc229519372"/>
       <w:r>
         <w:rPr>
           <w:i/>
         </w:rPr>
-        <w:lastRenderedPageBreak/>
         <w:t>ABSTRACT</w:t>
       </w:r>
       <w:bookmarkEnd w:id="5"/>
@@ -6025,7 +6612,7 @@
         </w:numPr>
         <w:ind w:right="-7"/>
       </w:pPr>
-      <w:bookmarkStart w:id="7" w:name="_Toc229427075"/>
+      <w:bookmarkStart w:id="7" w:name="_Toc229519373"/>
       <w:r>
         <w:lastRenderedPageBreak/>
         <w:t>BAB I</w:t>
@@ -6041,7 +6628,7 @@
         </w:numPr>
         <w:ind w:right="-7"/>
       </w:pPr>
-      <w:bookmarkStart w:id="8" w:name="_Toc229427076"/>
+      <w:bookmarkStart w:id="8" w:name="_Toc229519374"/>
       <w:r>
         <w:t>PENDAHULUAN</w:t>
       </w:r>
@@ -6075,7 +6662,7 @@
         </w:numPr>
         <w:ind w:right="-7"/>
       </w:pPr>
-      <w:bookmarkStart w:id="9" w:name="_Toc229427077"/>
+      <w:bookmarkStart w:id="9" w:name="_Toc229519375"/>
       <w:r>
         <w:t>1.1.</w:t>
       </w:r>
@@ -6256,7 +6843,7 @@
         </w:numPr>
         <w:ind w:right="-7"/>
       </w:pPr>
-      <w:bookmarkStart w:id="10" w:name="_Toc229427078"/>
+      <w:bookmarkStart w:id="10" w:name="_Toc229519376"/>
       <w:r>
         <w:t>1.2.</w:t>
       </w:r>
@@ -6264,14 +6851,18 @@
         <w:tab/>
       </w:r>
       <w:r>
-        <w:t>Identifikasi Masalah</w:t>
+        <w:t xml:space="preserve">Rumusan </w:t>
+      </w:r>
+      <w:r>
+        <w:t>Masalah</w:t>
       </w:r>
       <w:bookmarkEnd w:id="10"/>
     </w:p>
     <w:p>
       <w:pPr>
+        <w:pStyle w:val="ListParagraph"/>
         <w:spacing w:line="360" w:lineRule="auto"/>
-        <w:ind w:firstLine="720"/>
+        <w:ind w:left="0" w:firstLine="720"/>
         <w:jc w:val="both"/>
         <w:rPr>
           <w:sz w:val="24"/>
@@ -6283,13 +6874,14 @@
           <w:sz w:val="24"/>
           <w:szCs w:val="24"/>
         </w:rPr>
-        <w:t>Berdasarkan latar belakang yang telah diuraikan, terdapat beberapa permasalahan yang menjadi dasar dalam penelitian ini. Hunian mikro memiliki keterbatasan ruang yang menuntut penataan interior yang efisien dan fungsional. Namun, pemahaman mengenai desain interior fungsional masih sulit dipelajari oleh masyarakat umum karena media pembelajaran yang tersedia cenderung bersifat pasif dan kurang interaktif.</w:t>
+        <w:t>Berdasarkan latar belakang yang telah diuraikan, hunian mikro memiliki keterbatasan ruang yang menuntut penataan interior yang efisien dan fungsional. Namun, media pembelajaran desain interior yang tersedia saat ini masih cenderung pasif dan kurang interaktif sehingga sulit dipahami oleh masyarakat umum. Di sisi lain, game simulasi interior yang ada umumnya lebih berfokus pada aspek dekoratif dan kebebasan kreativitas dibandingkan penerapan prinsip optimasi ruang dan fungsi ruang. Selain itu, mekanisme penilaian dalam game simulasi interior juga masih banyak yang bersifat subjektif dan belum menerapkan evaluasi berbasis optimasi spasial secara terukur.</w:t>
       </w:r>
     </w:p>
     <w:p>
       <w:pPr>
+        <w:pStyle w:val="ListParagraph"/>
         <w:spacing w:line="360" w:lineRule="auto"/>
-        <w:ind w:firstLine="720"/>
+        <w:ind w:left="0" w:firstLine="720"/>
         <w:jc w:val="both"/>
         <w:rPr>
           <w:sz w:val="24"/>
@@ -6301,21 +6893,7 @@
           <w:sz w:val="24"/>
           <w:szCs w:val="24"/>
         </w:rPr>
-        <w:t>Di sisi lain, game simulasi interior yang tersedia saat ini umumnya lebih berfokus pada aspek dekoratif dan kebebasan kreativitas dibandingkan penerapan prinsip optimasi ruang dan fungsi ruang. Mekanisme penilaian dalam game juga masih banyak yang bersifat subjektif dan belum memanfaatkan pendekatan evaluasi berbasis optimasi spasial secara terukur.</w:t>
-      </w:r>
-      <w:r>
-        <w:rPr>
-          <w:sz w:val="24"/>
-          <w:szCs w:val="24"/>
-        </w:rPr>
-        <w:t xml:space="preserve"> </w:t>
-      </w:r>
-      <w:r>
-        <w:rPr>
-          <w:sz w:val="24"/>
-          <w:szCs w:val="24"/>
-        </w:rPr>
-        <w:t>Berdasarkan permasalahan tersebut, dapat dirumuskan beberapa poin identifikasi masalah sebagai berikut:</w:t>
+        <w:t>Berdasarkan permasalahan tersebut, maka rumusan masalah dalam penelitian ini adalah sebagai berikut:</w:t>
       </w:r>
     </w:p>
     <w:p>
@@ -6323,7 +6901,7 @@
         <w:pStyle w:val="ListParagraph"/>
         <w:numPr>
           <w:ilvl w:val="0"/>
-          <w:numId w:val="3"/>
+          <w:numId w:val="11"/>
         </w:numPr>
         <w:spacing w:line="360" w:lineRule="auto"/>
         <w:jc w:val="both"/>
@@ -6337,7 +6915,7 @@
           <w:sz w:val="24"/>
           <w:szCs w:val="24"/>
         </w:rPr>
-        <w:t>Media pembelajaran desain interior yang tersedia masih kurang interaktif dan kurang efektif untuk pengguna awam.</w:t>
+        <w:t xml:space="preserve">Bagaimana merancang dan mengembangkan game simulasi hunian mikro sebagai media edukasi desain interior fungsional? </w:t>
       </w:r>
     </w:p>
     <w:p>
@@ -6345,7 +6923,7 @@
         <w:pStyle w:val="ListParagraph"/>
         <w:numPr>
           <w:ilvl w:val="0"/>
-          <w:numId w:val="3"/>
+          <w:numId w:val="11"/>
         </w:numPr>
         <w:spacing w:line="360" w:lineRule="auto"/>
         <w:jc w:val="both"/>
@@ -6359,7 +6937,7 @@
           <w:sz w:val="24"/>
           <w:szCs w:val="24"/>
         </w:rPr>
-        <w:t>Game simulasi interior yang ada saat ini lebih berorientasi pada estetika dibandingkan edukasi desain interior fungsional.</w:t>
+        <w:t xml:space="preserve">Bagaimana mengimplementasikan mekanisme environmental-spatial optimization untuk mengevaluasi efisiensi dan fungsi tata ruang dalam permainan? </w:t>
       </w:r>
     </w:p>
     <w:p>
@@ -6367,7 +6945,7 @@
         <w:pStyle w:val="ListParagraph"/>
         <w:numPr>
           <w:ilvl w:val="0"/>
-          <w:numId w:val="3"/>
+          <w:numId w:val="11"/>
         </w:numPr>
         <w:spacing w:line="360" w:lineRule="auto"/>
         <w:jc w:val="both"/>
@@ -6381,7 +6959,7 @@
           <w:sz w:val="24"/>
           <w:szCs w:val="24"/>
         </w:rPr>
-        <w:t>Mekanisme evaluasi dalam game simulasi interior belum banyak menerapkan pendekatan environmental-spatial optimization untuk menilai efisiensi ruang secara objektif.</w:t>
+        <w:t xml:space="preserve">Bagaimana merancang sistem pembelajaran interaktif berbasis simulasi agar pengguna dapat memahami prinsip desain interior pada ruang terbatas secara lebih mudah? </w:t>
       </w:r>
     </w:p>
     <w:p>
@@ -6389,7 +6967,7 @@
         <w:pStyle w:val="ListParagraph"/>
         <w:numPr>
           <w:ilvl w:val="0"/>
-          <w:numId w:val="3"/>
+          <w:numId w:val="11"/>
         </w:numPr>
         <w:spacing w:line="360" w:lineRule="auto"/>
         <w:jc w:val="both"/>
@@ -6403,37 +6981,7 @@
           <w:sz w:val="24"/>
           <w:szCs w:val="24"/>
         </w:rPr>
-        <w:t>Belum banyak inovasi game edukasi yang menggabungkan simulasi hunian mikro dengan sistem optimasi tata ruang sebagai sarana pembelajaran interaktif.</w:t>
-      </w:r>
-    </w:p>
-    <w:p>
-      <w:pPr>
-        <w:pStyle w:val="ListParagraph"/>
-        <w:numPr>
-          <w:ilvl w:val="0"/>
-          <w:numId w:val="3"/>
-        </w:numPr>
-        <w:spacing w:line="360" w:lineRule="auto"/>
-        <w:jc w:val="both"/>
-        <w:rPr>
-          <w:sz w:val="24"/>
-          <w:szCs w:val="24"/>
-        </w:rPr>
-      </w:pPr>
-      <w:r>
-        <w:rPr>
-          <w:sz w:val="24"/>
-          <w:szCs w:val="24"/>
-        </w:rPr>
-        <w:t xml:space="preserve">Diperlukan pengembangan game simulasi edukatif yang mampu memberikan pengalaman belajar desain interior fungsional secara interaktif, </w:t>
-      </w:r>
-      <w:r>
-        <w:rPr>
-          <w:sz w:val="24"/>
-          <w:szCs w:val="24"/>
-        </w:rPr>
-        <w:lastRenderedPageBreak/>
-        <w:t>praktis, dan mudah dipahami pengguna.</w:t>
+        <w:t>Bagaimana efektivitas game simulasi yang dikembangkan dalam membantu pengguna memahami konsep desain interior fungsional pada hunian mikro?</w:t>
       </w:r>
     </w:p>
     <w:p>
@@ -6456,7 +7004,7 @@
         </w:numPr>
         <w:ind w:right="-7"/>
       </w:pPr>
-      <w:bookmarkStart w:id="11" w:name="_Toc229427079"/>
+      <w:bookmarkStart w:id="11" w:name="_Toc229519377"/>
       <w:r>
         <w:t>1.3.</w:t>
       </w:r>
@@ -6482,7 +7030,15 @@
           <w:sz w:val="24"/>
           <w:szCs w:val="24"/>
         </w:rPr>
-        <w:t>Berdasarkan identifikasi masalah dan batasan yang telah diuraikan, penelitian ini memiliki beberapa tujuan utama yang ingin dicapai. Tujuan-tujuan tersebut dirancang untuk menjawab kebutuhan media edukasi desain interior yang lebih interaktif sekaligus menghadirkan inovasi produk berbasis game simulasi. Secara spesifik, tujuan penelitian ini dapat dijabarkan sebagai berikut:</w:t>
+        <w:t xml:space="preserve">Berdasarkan identifikasi masalah dan batasan yang telah diuraikan, penelitian </w:t>
+      </w:r>
+      <w:r>
+        <w:rPr>
+          <w:sz w:val="24"/>
+          <w:szCs w:val="24"/>
+        </w:rPr>
+        <w:lastRenderedPageBreak/>
+        <w:t>ini memiliki beberapa tujuan utama yang ingin dicapai. Tujuan-tujuan tersebut dirancang untuk menjawab kebutuhan media edukasi desain interior yang lebih interaktif sekaligus menghadirkan inovasi produk berbasis game simulasi. Secara spesifik, tujuan penelitian ini dapat dijabarkan sebagai berikut:</w:t>
       </w:r>
     </w:p>
     <w:p>
@@ -6588,7 +7144,7 @@
         </w:numPr>
         <w:ind w:right="-7"/>
       </w:pPr>
-      <w:bookmarkStart w:id="12" w:name="_Toc229427080"/>
+      <w:bookmarkStart w:id="12" w:name="_Toc229519378"/>
       <w:r>
         <w:t>1.4.</w:t>
       </w:r>
@@ -6781,7 +7337,6 @@
           <w:sz w:val="24"/>
           <w:szCs w:val="24"/>
         </w:rPr>
-        <w:lastRenderedPageBreak/>
         <w:t>Menjadi dasar pengembangan penelitian dan produk sejenis di bidang game edukasi, simulasi interior, dan optimasi tata ruang di masa mendat</w:t>
       </w:r>
     </w:p>
@@ -6794,7 +7349,7 @@
         </w:numPr>
         <w:ind w:right="-7"/>
       </w:pPr>
-      <w:bookmarkStart w:id="13" w:name="_Toc229427081"/>
+      <w:bookmarkStart w:id="13" w:name="_Toc229519379"/>
       <w:r>
         <w:lastRenderedPageBreak/>
         <w:t>BAB II</w:t>
@@ -6810,7 +7365,7 @@
         </w:numPr>
         <w:ind w:right="-7"/>
       </w:pPr>
-      <w:bookmarkStart w:id="14" w:name="_Toc229427082"/>
+      <w:bookmarkStart w:id="14" w:name="_Toc229519380"/>
       <w:r>
         <w:t>Penelitian Terkait</w:t>
       </w:r>
@@ -6831,7 +7386,7 @@
         </w:numPr>
         <w:ind w:right="-7"/>
       </w:pPr>
-      <w:bookmarkStart w:id="15" w:name="_Toc229427083"/>
+      <w:bookmarkStart w:id="15" w:name="_Toc229519381"/>
       <w:r>
         <w:t xml:space="preserve">2.1. </w:t>
       </w:r>
@@ -12187,7 +12742,7 @@
         </w:numPr>
         <w:ind w:right="-7"/>
       </w:pPr>
-      <w:bookmarkStart w:id="16" w:name="_Toc229427084"/>
+      <w:bookmarkStart w:id="16" w:name="_Toc229519382"/>
       <w:r>
         <w:t>2.2.</w:t>
       </w:r>
@@ -18311,7 +18866,7 @@
         </w:numPr>
         <w:ind w:right="-7"/>
       </w:pPr>
-      <w:bookmarkStart w:id="17" w:name="_Toc229427085"/>
+      <w:bookmarkStart w:id="17" w:name="_Toc229519383"/>
       <w:r>
         <w:t>2.3.</w:t>
       </w:r>
@@ -24710,7 +25265,7 @@
         </w:numPr>
         <w:ind w:right="-7"/>
       </w:pPr>
-      <w:bookmarkStart w:id="18" w:name="_Toc229427086"/>
+      <w:bookmarkStart w:id="18" w:name="_Toc229519384"/>
       <w:r>
         <w:t>2.4.</w:t>
       </w:r>
@@ -24757,12 +25312,9 @@
         </w:numPr>
         <w:ind w:left="709" w:hanging="720"/>
       </w:pPr>
-      <w:bookmarkStart w:id="19" w:name="_Toc229427087"/>
-      <w:r>
-        <w:t>2.4.</w:t>
-      </w:r>
-      <w:r>
-        <w:t>1.</w:t>
+      <w:bookmarkStart w:id="19" w:name="_Toc229519385"/>
+      <w:r>
+        <w:t>2.4.1.</w:t>
       </w:r>
       <w:r>
         <w:tab/>
@@ -27319,15 +27871,9 @@
           <w:iCs/>
         </w:rPr>
       </w:pPr>
-      <w:bookmarkStart w:id="20" w:name="_Toc229427088"/>
-      <w:r>
-        <w:t>2.4.</w:t>
-      </w:r>
-      <w:r>
-        <w:t>2</w:t>
-      </w:r>
-      <w:r>
-        <w:t>.</w:t>
+      <w:bookmarkStart w:id="20" w:name="_Toc229519386"/>
+      <w:r>
+        <w:t>2.4.2.</w:t>
       </w:r>
       <w:r>
         <w:tab/>
@@ -29276,15 +29822,9 @@
         </w:numPr>
         <w:ind w:left="709" w:hanging="720"/>
       </w:pPr>
-      <w:bookmarkStart w:id="21" w:name="_Toc229427089"/>
-      <w:r>
-        <w:t>2.4.</w:t>
-      </w:r>
-      <w:r>
-        <w:t>3</w:t>
-      </w:r>
-      <w:r>
-        <w:t>.</w:t>
+      <w:bookmarkStart w:id="21" w:name="_Toc229519387"/>
+      <w:r>
+        <w:t>2.4.3.</w:t>
       </w:r>
       <w:r>
         <w:tab/>
@@ -31380,15 +31920,9 @@
         </w:numPr>
         <w:ind w:left="709" w:hanging="720"/>
       </w:pPr>
-      <w:bookmarkStart w:id="22" w:name="_Toc229427090"/>
-      <w:r>
-        <w:t>2.4.</w:t>
-      </w:r>
-      <w:r>
-        <w:t>4</w:t>
-      </w:r>
-      <w:r>
-        <w:t>.</w:t>
+      <w:bookmarkStart w:id="22" w:name="_Toc229519388"/>
+      <w:r>
+        <w:t>2.4.4.</w:t>
       </w:r>
       <w:r>
         <w:tab/>
@@ -33568,7 +34102,7 @@
         </w:numPr>
         <w:ind w:right="-7"/>
       </w:pPr>
-      <w:bookmarkStart w:id="23" w:name="_Toc229427091"/>
+      <w:bookmarkStart w:id="23" w:name="_Toc229519389"/>
       <w:r>
         <w:t>2.5.</w:t>
       </w:r>
@@ -38131,7 +38665,7 @@
         </w:numPr>
         <w:ind w:right="-7"/>
       </w:pPr>
-      <w:bookmarkStart w:id="24" w:name="_Toc229427092"/>
+      <w:bookmarkStart w:id="24" w:name="_Toc229519390"/>
       <w:r>
         <w:t>BAB III</w:t>
       </w:r>
@@ -38146,7 +38680,7 @@
         </w:numPr>
         <w:ind w:right="-7"/>
       </w:pPr>
-      <w:bookmarkStart w:id="25" w:name="_Toc229427093"/>
+      <w:bookmarkStart w:id="25" w:name="_Toc229519391"/>
       <w:r>
         <w:t>METODOLOGI PENELITIAN</w:t>
       </w:r>
@@ -38180,13 +38714,16 @@
         </w:numPr>
         <w:ind w:right="-7"/>
       </w:pPr>
-      <w:bookmarkStart w:id="26" w:name="_Toc229427094"/>
+      <w:bookmarkStart w:id="26" w:name="_Toc229519392"/>
       <w:r>
         <w:t>3.1.</w:t>
       </w:r>
       <w:r>
         <w:tab/>
         <w:t>Deskripsi Umum</w:t>
+      </w:r>
+      <w:r>
+        <w:t xml:space="preserve"> Penelitian</w:t>
       </w:r>
       <w:bookmarkEnd w:id="26"/>
     </w:p>
@@ -38199,55 +38736,291 @@
         </w:numPr>
         <w:ind w:right="-7"/>
       </w:pPr>
-      <w:bookmarkStart w:id="27" w:name="_Toc229427095"/>
+      <w:bookmarkStart w:id="27" w:name="_Toc229519393"/>
       <w:r>
         <w:t>3.2.</w:t>
       </w:r>
       <w:r>
         <w:tab/>
-        <w:t>Data</w:t>
+      </w:r>
+      <w:r>
+        <w:t>Metod</w:t>
+      </w:r>
+      <w:r>
+        <w:t>ologi</w:t>
+      </w:r>
+      <w:r>
+        <w:t xml:space="preserve"> Penelitian</w:t>
       </w:r>
       <w:bookmarkEnd w:id="27"/>
+      <w:r>
+        <w:t xml:space="preserve"> </w:t>
+      </w:r>
     </w:p>
     <w:p>
       <w:pPr>
-        <w:pStyle w:val="Heading2"/>
+        <w:pStyle w:val="Heading3"/>
         <w:numPr>
           <w:ilvl w:val="0"/>
           <w:numId w:val="0"/>
         </w:numPr>
-        <w:ind w:right="-7"/>
+        <w:ind w:left="709" w:hanging="720"/>
       </w:pPr>
       <w:bookmarkStart w:id="28" w:name="_heading=h.lj0ielra2qpa" w:colFirst="0" w:colLast="0"/>
-      <w:bookmarkStart w:id="29" w:name="_Toc229427096"/>
+      <w:bookmarkStart w:id="29" w:name="_Toc229519394"/>
       <w:bookmarkEnd w:id="28"/>
       <w:r>
-        <w:t>3.3.</w:t>
+        <w:t>3.</w:t>
+      </w:r>
+      <w:r>
+        <w:t>2</w:t>
+      </w:r>
+      <w:r>
+        <w:t>.</w:t>
+      </w:r>
+      <w:r>
+        <w:t>1.</w:t>
       </w:r>
       <w:r>
         <w:tab/>
-        <w:t>Rancangan Model</w:t>
+      </w:r>
+      <w:r>
+        <w:t>Tahap Perencanaan</w:t>
       </w:r>
       <w:bookmarkEnd w:id="29"/>
     </w:p>
     <w:p>
       <w:pPr>
-        <w:pStyle w:val="Heading2"/>
+        <w:pStyle w:val="Heading3"/>
         <w:numPr>
           <w:ilvl w:val="0"/>
           <w:numId w:val="0"/>
         </w:numPr>
-        <w:ind w:right="-7"/>
+        <w:ind w:left="709" w:hanging="720"/>
       </w:pPr>
-      <w:bookmarkStart w:id="30" w:name="_Toc229427097"/>
-      <w:r>
-        <w:t xml:space="preserve">3.4. </w:t>
+      <w:bookmarkStart w:id="30" w:name="_Toc229519395"/>
+      <w:r>
+        <w:t>3.</w:t>
+      </w:r>
+      <w:r>
+        <w:t>2</w:t>
+      </w:r>
+      <w:r>
+        <w:t>.</w:t>
+      </w:r>
+      <w:r>
+        <w:t>2</w:t>
+      </w:r>
+      <w:r>
+        <w:t>.</w:t>
       </w:r>
       <w:r>
         <w:tab/>
-        <w:t>Rancangan Pengujian dan Analisis</w:t>
+      </w:r>
+      <w:r>
+        <w:t xml:space="preserve">Tahap Perancangan </w:t>
+      </w:r>
+      <w:r>
+        <w:rPr>
+          <w:i/>
+          <w:iCs/>
+        </w:rPr>
+        <w:t>Gameplay</w:t>
+      </w:r>
+      <w:r>
+        <w:t xml:space="preserve"> dan Sistem</w:t>
       </w:r>
       <w:bookmarkEnd w:id="30"/>
+    </w:p>
+    <w:p>
+      <w:pPr>
+        <w:pStyle w:val="Heading3"/>
+        <w:numPr>
+          <w:ilvl w:val="0"/>
+          <w:numId w:val="0"/>
+        </w:numPr>
+        <w:ind w:left="709" w:hanging="720"/>
+      </w:pPr>
+      <w:bookmarkStart w:id="31" w:name="_Toc229519396"/>
+      <w:r>
+        <w:t>3.</w:t>
+      </w:r>
+      <w:r>
+        <w:t>2</w:t>
+      </w:r>
+      <w:r>
+        <w:t>.</w:t>
+      </w:r>
+      <w:r>
+        <w:t>3</w:t>
+      </w:r>
+      <w:r>
+        <w:t>.</w:t>
+      </w:r>
+      <w:r>
+        <w:tab/>
+      </w:r>
+      <w:r>
+        <w:t xml:space="preserve">Tahap Perancangan Mekanisme </w:t>
+      </w:r>
+      <w:r>
+        <w:rPr>
+          <w:i/>
+          <w:iCs/>
+        </w:rPr>
+        <w:t>Environmental-Spatial Optimization</w:t>
+      </w:r>
+      <w:bookmarkEnd w:id="31"/>
+    </w:p>
+    <w:p>
+      <w:pPr>
+        <w:pStyle w:val="Heading3"/>
+        <w:numPr>
+          <w:ilvl w:val="0"/>
+          <w:numId w:val="0"/>
+        </w:numPr>
+        <w:ind w:left="709" w:hanging="720"/>
+      </w:pPr>
+      <w:bookmarkStart w:id="32" w:name="_Toc229519397"/>
+      <w:r>
+        <w:t>3.</w:t>
+      </w:r>
+      <w:r>
+        <w:t>2</w:t>
+      </w:r>
+      <w:r>
+        <w:t>.</w:t>
+      </w:r>
+      <w:r>
+        <w:t>4</w:t>
+      </w:r>
+      <w:r>
+        <w:t>.</w:t>
+      </w:r>
+      <w:r>
+        <w:tab/>
+      </w:r>
+      <w:r>
+        <w:t>Tahap Perancangan UI/UX</w:t>
+      </w:r>
+      <w:bookmarkEnd w:id="32"/>
+    </w:p>
+    <w:p>
+      <w:pPr>
+        <w:pStyle w:val="Heading3"/>
+        <w:numPr>
+          <w:ilvl w:val="0"/>
+          <w:numId w:val="0"/>
+        </w:numPr>
+        <w:ind w:left="709" w:hanging="720"/>
+      </w:pPr>
+      <w:bookmarkStart w:id="33" w:name="_Toc229519398"/>
+      <w:r>
+        <w:t>3.2.</w:t>
+      </w:r>
+      <w:r>
+        <w:t>5</w:t>
+      </w:r>
+      <w:r>
+        <w:t>.</w:t>
+      </w:r>
+      <w:r>
+        <w:tab/>
+      </w:r>
+      <w:r>
+        <w:t xml:space="preserve">Tahap </w:t>
+      </w:r>
+      <w:r>
+        <w:t>Implementasi Sistem</w:t>
+      </w:r>
+      <w:bookmarkEnd w:id="33"/>
+    </w:p>
+    <w:p>
+      <w:pPr>
+        <w:pStyle w:val="Heading3"/>
+        <w:numPr>
+          <w:ilvl w:val="0"/>
+          <w:numId w:val="0"/>
+        </w:numPr>
+        <w:ind w:left="709" w:hanging="720"/>
+      </w:pPr>
+      <w:bookmarkStart w:id="34" w:name="_Toc229519399"/>
+      <w:r>
+        <w:t>3.2.</w:t>
+      </w:r>
+      <w:r>
+        <w:t>6</w:t>
+      </w:r>
+      <w:r>
+        <w:t>.</w:t>
+      </w:r>
+      <w:r>
+        <w:tab/>
+      </w:r>
+      <w:r>
+        <w:t xml:space="preserve">Tahap </w:t>
+      </w:r>
+      <w:r>
+        <w:t>Pengujian Sistem</w:t>
+      </w:r>
+      <w:bookmarkEnd w:id="34"/>
+    </w:p>
+    <w:p>
+      <w:pPr>
+        <w:pStyle w:val="Heading3"/>
+        <w:numPr>
+          <w:ilvl w:val="0"/>
+          <w:numId w:val="0"/>
+        </w:numPr>
+        <w:ind w:left="709" w:hanging="720"/>
+      </w:pPr>
+      <w:bookmarkStart w:id="35" w:name="_Toc229519400"/>
+      <w:r>
+        <w:t>3.2.</w:t>
+      </w:r>
+      <w:r>
+        <w:t>7</w:t>
+      </w:r>
+      <w:r>
+        <w:t>.</w:t>
+      </w:r>
+      <w:r>
+        <w:tab/>
+      </w:r>
+      <w:r>
+        <w:t>Tahap Pengumpulan dan Analisis Data Pengguna</w:t>
+      </w:r>
+      <w:bookmarkEnd w:id="35"/>
+    </w:p>
+    <w:p>
+      <w:pPr>
+        <w:pStyle w:val="Heading3"/>
+        <w:numPr>
+          <w:ilvl w:val="0"/>
+          <w:numId w:val="0"/>
+        </w:numPr>
+        <w:ind w:left="709" w:hanging="720"/>
+      </w:pPr>
+      <w:bookmarkStart w:id="36" w:name="_Toc229519401"/>
+      <w:r>
+        <w:t>3.2.</w:t>
+      </w:r>
+      <w:r>
+        <w:t>8</w:t>
+      </w:r>
+      <w:r>
+        <w:t>.</w:t>
+      </w:r>
+      <w:r>
+        <w:tab/>
+      </w:r>
+      <w:r>
+        <w:t xml:space="preserve">Tahap </w:t>
+      </w:r>
+      <w:r>
+        <w:t>Evaluasi</w:t>
+      </w:r>
+      <w:bookmarkEnd w:id="36"/>
     </w:p>
     <w:p>
       <w:pPr>
@@ -38430,12 +39203,12 @@
         </w:numPr>
         <w:ind w:right="-7"/>
       </w:pPr>
-      <w:bookmarkStart w:id="31" w:name="_Toc229427098"/>
+      <w:bookmarkStart w:id="37" w:name="_Toc229519402"/>
       <w:r>
         <w:lastRenderedPageBreak/>
         <w:t>BAB IV</w:t>
       </w:r>
-      <w:bookmarkEnd w:id="31"/>
+      <w:bookmarkEnd w:id="37"/>
     </w:p>
     <w:p>
       <w:pPr>
@@ -38446,11 +39219,11 @@
         </w:numPr>
         <w:ind w:right="-7"/>
       </w:pPr>
-      <w:bookmarkStart w:id="32" w:name="_Toc229427099"/>
+      <w:bookmarkStart w:id="38" w:name="_Toc229519403"/>
       <w:r>
         <w:t>Jadwal Peneletian</w:t>
       </w:r>
-      <w:bookmarkEnd w:id="32"/>
+      <w:bookmarkEnd w:id="38"/>
     </w:p>
     <w:p>
       <w:pPr>
@@ -38499,7 +39272,7 @@
         </w:numPr>
         <w:ind w:right="-7"/>
       </w:pPr>
-      <w:bookmarkStart w:id="33" w:name="_Toc229427100"/>
+      <w:bookmarkStart w:id="39" w:name="_Toc229519404"/>
       <w:r>
         <w:t>4.1.</w:t>
       </w:r>
@@ -38509,7 +39282,7 @@
       <w:r>
         <w:t>Jadwal Penelitian</w:t>
       </w:r>
-      <w:bookmarkEnd w:id="33"/>
+      <w:bookmarkEnd w:id="39"/>
     </w:p>
     <w:p>
       <w:pPr>
@@ -38532,11 +39305,11 @@
         </w:numPr>
         <w:ind w:right="-7"/>
       </w:pPr>
-      <w:bookmarkStart w:id="34" w:name="_Toc229427101"/>
+      <w:bookmarkStart w:id="40" w:name="_Toc229519405"/>
       <w:r>
         <w:t>DAFTAR PUSTAKA</w:t>
       </w:r>
-      <w:bookmarkEnd w:id="34"/>
+      <w:bookmarkEnd w:id="40"/>
     </w:p>
     <w:p/>
     <w:p>
@@ -39124,12 +39897,12 @@
         </w:numPr>
         <w:ind w:right="-7"/>
       </w:pPr>
-      <w:bookmarkStart w:id="35" w:name="_Toc229427102"/>
+      <w:bookmarkStart w:id="41" w:name="_Toc229519406"/>
       <w:r>
         <w:lastRenderedPageBreak/>
         <w:t>LAMPIRAN</w:t>
       </w:r>
-      <w:bookmarkEnd w:id="35"/>
+      <w:bookmarkEnd w:id="41"/>
     </w:p>
     <w:p>
       <w:pPr>
@@ -40324,6 +41097,95 @@
     </w:lvl>
   </w:abstractNum>
   <w:abstractNum w:abstractNumId="5" w15:restartNumberingAfterBreak="0">
+    <w:nsid w:val="523B5FB4"/>
+    <w:multiLevelType w:val="hybridMultilevel"/>
+    <w:tmpl w:val="8F5066BA"/>
+    <w:lvl w:ilvl="0" w:tplc="3809000F">
+      <w:start w:val="1"/>
+      <w:numFmt w:val="decimal"/>
+      <w:lvlText w:val="%1."/>
+      <w:lvlJc w:val="left"/>
+      <w:pPr>
+        <w:ind w:left="720" w:hanging="360"/>
+      </w:pPr>
+      <w:rPr>
+        <w:rFonts w:hint="default"/>
+      </w:rPr>
+    </w:lvl>
+    <w:lvl w:ilvl="1" w:tplc="38090019" w:tentative="1">
+      <w:start w:val="1"/>
+      <w:numFmt w:val="lowerLetter"/>
+      <w:lvlText w:val="%2."/>
+      <w:lvlJc w:val="left"/>
+      <w:pPr>
+        <w:ind w:left="1440" w:hanging="360"/>
+      </w:pPr>
+    </w:lvl>
+    <w:lvl w:ilvl="2" w:tplc="3809001B" w:tentative="1">
+      <w:start w:val="1"/>
+      <w:numFmt w:val="lowerRoman"/>
+      <w:lvlText w:val="%3."/>
+      <w:lvlJc w:val="right"/>
+      <w:pPr>
+        <w:ind w:left="2160" w:hanging="180"/>
+      </w:pPr>
+    </w:lvl>
+    <w:lvl w:ilvl="3" w:tplc="3809000F" w:tentative="1">
+      <w:start w:val="1"/>
+      <w:numFmt w:val="decimal"/>
+      <w:lvlText w:val="%4."/>
+      <w:lvlJc w:val="left"/>
+      <w:pPr>
+        <w:ind w:left="2880" w:hanging="360"/>
+      </w:pPr>
+    </w:lvl>
+    <w:lvl w:ilvl="4" w:tplc="38090019" w:tentative="1">
+      <w:start w:val="1"/>
+      <w:numFmt w:val="lowerLetter"/>
+      <w:lvlText w:val="%5."/>
+      <w:lvlJc w:val="left"/>
+      <w:pPr>
+        <w:ind w:left="3600" w:hanging="360"/>
+      </w:pPr>
+    </w:lvl>
+    <w:lvl w:ilvl="5" w:tplc="3809001B" w:tentative="1">
+      <w:start w:val="1"/>
+      <w:numFmt w:val="lowerRoman"/>
+      <w:lvlText w:val="%6."/>
+      <w:lvlJc w:val="right"/>
+      <w:pPr>
+        <w:ind w:left="4320" w:hanging="180"/>
+      </w:pPr>
+    </w:lvl>
+    <w:lvl w:ilvl="6" w:tplc="3809000F" w:tentative="1">
+      <w:start w:val="1"/>
+      <w:numFmt w:val="decimal"/>
+      <w:lvlText w:val="%7."/>
+      <w:lvlJc w:val="left"/>
+      <w:pPr>
+        <w:ind w:left="5040" w:hanging="360"/>
+      </w:pPr>
+    </w:lvl>
+    <w:lvl w:ilvl="7" w:tplc="38090019" w:tentative="1">
+      <w:start w:val="1"/>
+      <w:numFmt w:val="lowerLetter"/>
+      <w:lvlText w:val="%8."/>
+      <w:lvlJc w:val="left"/>
+      <w:pPr>
+        <w:ind w:left="5760" w:hanging="360"/>
+      </w:pPr>
+    </w:lvl>
+    <w:lvl w:ilvl="8" w:tplc="3809001B" w:tentative="1">
+      <w:start w:val="1"/>
+      <w:numFmt w:val="lowerRoman"/>
+      <w:lvlText w:val="%9."/>
+      <w:lvlJc w:val="right"/>
+      <w:pPr>
+        <w:ind w:left="6480" w:hanging="180"/>
+      </w:pPr>
+    </w:lvl>
+  </w:abstractNum>
+  <w:abstractNum w:abstractNumId="6" w15:restartNumberingAfterBreak="0">
     <w:nsid w:val="599E447D"/>
     <w:multiLevelType w:val="multilevel"/>
     <w:tmpl w:val="44A26610"/>
@@ -40436,7 +41298,7 @@
       </w:rPr>
     </w:lvl>
   </w:abstractNum>
-  <w:abstractNum w:abstractNumId="6" w15:restartNumberingAfterBreak="0">
+  <w:abstractNum w:abstractNumId="7" w15:restartNumberingAfterBreak="0">
     <w:nsid w:val="5BBB4C8F"/>
     <w:multiLevelType w:val="hybridMultilevel"/>
     <w:tmpl w:val="F3E0600A"/>
@@ -40525,7 +41387,7 @@
       </w:pPr>
     </w:lvl>
   </w:abstractNum>
-  <w:abstractNum w:abstractNumId="7" w15:restartNumberingAfterBreak="0">
+  <w:abstractNum w:abstractNumId="8" w15:restartNumberingAfterBreak="0">
     <w:nsid w:val="609212C6"/>
     <w:multiLevelType w:val="multilevel"/>
     <w:tmpl w:val="EE84D856"/>
@@ -40638,7 +41500,7 @@
       </w:rPr>
     </w:lvl>
   </w:abstractNum>
-  <w:abstractNum w:abstractNumId="8" w15:restartNumberingAfterBreak="0">
+  <w:abstractNum w:abstractNumId="9" w15:restartNumberingAfterBreak="0">
     <w:nsid w:val="63003920"/>
     <w:multiLevelType w:val="multilevel"/>
     <w:tmpl w:val="A5A4F442"/>
@@ -40760,7 +41622,7 @@
       </w:pPr>
     </w:lvl>
   </w:abstractNum>
-  <w:abstractNum w:abstractNumId="9" w15:restartNumberingAfterBreak="0">
+  <w:abstractNum w:abstractNumId="10" w15:restartNumberingAfterBreak="0">
     <w:nsid w:val="73C342A1"/>
     <w:multiLevelType w:val="multilevel"/>
     <w:tmpl w:val="9EA46B54"/>
@@ -40877,22 +41739,22 @@
     <w:abstractNumId w:val="1"/>
   </w:num>
   <w:num w:numId="2" w16cid:durableId="616134477">
-    <w:abstractNumId w:val="8"/>
+    <w:abstractNumId w:val="9"/>
   </w:num>
   <w:num w:numId="3" w16cid:durableId="5981257">
-    <w:abstractNumId w:val="6"/>
+    <w:abstractNumId w:val="7"/>
   </w:num>
   <w:num w:numId="4" w16cid:durableId="783575751">
     <w:abstractNumId w:val="4"/>
   </w:num>
   <w:num w:numId="5" w16cid:durableId="1913464763">
-    <w:abstractNumId w:val="7"/>
+    <w:abstractNumId w:val="8"/>
   </w:num>
   <w:num w:numId="6" w16cid:durableId="11272542">
-    <w:abstractNumId w:val="5"/>
+    <w:abstractNumId w:val="6"/>
   </w:num>
   <w:num w:numId="7" w16cid:durableId="1891334489">
-    <w:abstractNumId w:val="9"/>
+    <w:abstractNumId w:val="10"/>
   </w:num>
   <w:num w:numId="8" w16cid:durableId="488330051">
     <w:abstractNumId w:val="2"/>
@@ -40902,6 +41764,9 @@
   </w:num>
   <w:num w:numId="10" w16cid:durableId="1945846520">
     <w:abstractNumId w:val="3"/>
+  </w:num>
+  <w:num w:numId="11" w16cid:durableId="1134525930">
+    <w:abstractNumId w:val="5"/>
   </w:num>
 </w:numbering>
 </file>

</xml_diff>